<commit_message>
Shorten notes and set AMC to 18 months in v2 DPR
</commit_message>
<xml_diff>
--- a/DPR-CHC-Ramprasad-Biswas-Dakshin-Durgapur-2026-27-v2.docx
+++ b/DPR-CHC-Ramprasad-Biswas-Dakshin-Durgapur-2026-27-v2.docx
@@ -751,7 +751,7 @@
                 <w:i w:val="0"/>
                 <w:sz w:val="18"/>
               </w:rPr>
-              <w:t xml:space="preserve">Individual – farmer (rural entrepreneur)</w:t>
+              <w:t xml:space="preserve">Individual farmer (rural entrepreneur)</w:t>
             </w:r>
           </w:p>
         </w:tc>
@@ -925,7 +925,7 @@
                 <w:i w:val="0"/>
                 <w:sz w:val="18"/>
               </w:rPr>
-              <w:t xml:space="preserve">Vill. Dakshin Durgapur, P.O. Dakshin Durgapur, G.P. Deulbari Debipur, Block &amp; P.S. Kultali, Dist. South 24 Parganas, West Bengal, PIN 743349</w:t>
+              <w:t xml:space="preserve">Vill. &amp; P.O. Dakshin Durgapur, G.P. Deulbari Debipur, Block &amp; P.S. Kultali, Dist. South 24 Parganas, West Bengal, PIN 743349</w:t>
             </w:r>
           </w:p>
         </w:tc>
@@ -1273,7 +1273,7 @@
                 <w:i w:val="0"/>
                 <w:sz w:val="18"/>
               </w:rPr>
-              <w:t xml:space="preserve">Krishak Bandhu (Natun) / PM-KISAN registration No.</w:t>
+              <w:t xml:space="preserve">Krishak Bandhu (Natun) / PM-KISAN No.</w:t>
             </w:r>
           </w:p>
         </w:tc>
@@ -1297,7 +1297,7 @@
                 <w:sz w:val="18"/>
                 <w:highlight w:val="none"/>
               </w:rPr>
-              <w:t xml:space="preserve">To be furnished – Krishak Bandhu (Natun) registration is required; PM-KISAN if any (Cl. XI(d)(i))</w:t>
+              <w:t xml:space="preserve">To be furnished (Krishak Bandhu is required; PM-KISAN if any)</w:t>
             </w:r>
           </w:p>
         </w:tc>
@@ -1361,7 +1361,7 @@
                 <w:sz w:val="18"/>
                 <w:highlight w:val="none"/>
               </w:rPr>
-              <w:t xml:space="preserve">Farmer; his wife is also a farmer. Neither of them is or was a Govt./semi-Govt. employee, a civic volunteer or contractual staff</w:t>
+              <w:t xml:space="preserve">Farmer; his wife is also a farmer</w:t>
             </w:r>
           </w:p>
         </w:tc>
@@ -1381,7 +1381,7 @@
           <w:b w:val="0"/>
           <w:i w:val="0"/>
         </w:rPr>
-        <w:t xml:space="preserve">2.2 Eligibility under FMS 2026-27 (CHC – individual applicant, Cl. XI(d) and XI(g))</w:t>
+        <w:t xml:space="preserve">2.2 Eligibility (FMS 2026-27, Cl. XI)</w:t>
       </w:r>
     </w:p>
     <w:tbl>
@@ -1506,7 +1506,7 @@
                 <w:i w:val="0"/>
                 <w:sz w:val="18"/>
               </w:rPr>
-              <w:t xml:space="preserve">Rural entrepreneur (farmer) registered under Krishak Bandhu (Natun); PM-KISAN registration if any (Cl. XI(d)(i))</w:t>
+              <w:t xml:space="preserve">Farmer registered under Krishak Bandhu (Natun) (Cl. XI(d)(i))</w:t>
             </w:r>
           </w:p>
         </w:tc>
@@ -1524,7 +1524,7 @@
                 <w:i w:val="0"/>
                 <w:sz w:val="18"/>
               </w:rPr>
-              <w:t xml:space="preserve">Farmer of Vill. Dakshin Durgapur, G.P. Deulbari Debipur; Krishak Bandhu (Natun) registration No. to be furnished (Section 2.1)</w:t>
+              <w:t xml:space="preserve">Yes – farmer; registration No. to be furnished</w:t>
             </w:r>
           </w:p>
         </w:tc>
@@ -1564,7 +1564,7 @@
                 <w:i w:val="0"/>
                 <w:sz w:val="18"/>
               </w:rPr>
-              <w:t xml:space="preserve">TFO from Rs 20.00 lakh up to the SMAM maximum; subsidy for an individual Rs 16.00 lakh or 40% of TFO, whichever is less (Cl. XI(d)(i), XI(e)(ii))</w:t>
+              <w:t xml:space="preserve">TFO at least Rs 20 lakh; subsidy up to Rs 16 lakh or 40% of TFO, whichever is less (Cl. XI(e)(ii))</w:t>
             </w:r>
           </w:p>
         </w:tc>
@@ -1582,7 +1582,7 @@
                 <w:i w:val="0"/>
                 <w:sz w:val="18"/>
               </w:rPr>
-              <w:t xml:space="preserve">TFO Rs 29.57 lakh; subsidy Rs 11,15,636 – below Rs 11,82,980 (40% of TFO)</w:t>
+              <w:t xml:space="preserve">TFO Rs 29,57,450; subsidy Rs 11,15,636 (limit Rs 11,82,980)</w:t>
             </w:r>
           </w:p>
         </w:tc>
@@ -1622,7 +1622,7 @@
                 <w:i w:val="0"/>
                 <w:sz w:val="18"/>
               </w:rPr>
-              <w:t xml:space="preserve">Land in possession (own/leased/hired) of "commercial, bastu or viti" category; agricultural land not allowed (Cl. XI(d)(ii))</w:t>
+              <w:t xml:space="preserve">Land of commercial, bastu or viti class – own, leased or hired; not agricultural land (Cl. XI(d)(ii))</w:t>
             </w:r>
           </w:p>
         </w:tc>
@@ -1640,7 +1640,7 @@
                 <w:i w:val="0"/>
                 <w:sz w:val="18"/>
               </w:rPr>
-              <w:t xml:space="preserve">Own bastu land, 2 decimal (Mouza Dakshin Durgapur, J.L. No. 37, Khatian No. 682, Dag No. 317)</w:t>
+              <w:t xml:space="preserve">Yes – own bastu land, 2 decimal (Section 5.1)</w:t>
             </w:r>
           </w:p>
         </w:tc>
@@ -1680,7 +1680,7 @@
                 <w:i w:val="0"/>
                 <w:sz w:val="18"/>
               </w:rPr>
-              <w:t xml:space="preserve">Applicant aged 18–70 years at the time of application (Cl. XI(d)(iv))</w:t>
+              <w:t xml:space="preserve">Age 18–70 years (Cl. XI(d)(iv))</w:t>
             </w:r>
           </w:p>
         </w:tc>
@@ -1698,7 +1698,7 @@
                 <w:i w:val="0"/>
                 <w:sz w:val="18"/>
               </w:rPr>
-              <w:t xml:space="preserve">60 years</w:t>
+              <w:t xml:space="preserve">Yes – 60 years</w:t>
             </w:r>
           </w:p>
         </w:tc>
@@ -1738,7 +1738,7 @@
                 <w:i w:val="0"/>
                 <w:sz w:val="18"/>
               </w:rPr>
-              <w:t xml:space="preserve">Applicant (and spouse) not an employee or retired employee of Govt./statutory body/Govt. undertaking/Panchayat/municipality/local body/Govt.-aided institution, nor a civic volunteer or contractual staff (Cl. XI(d)(iii); Annexure-V, item iv)</w:t>
+              <w:t xml:space="preserve">Applicant and spouse are not serving or retired employees of any Govt. body, civic volunteers or contractual staff (Cl. XI(d)(iii))</w:t>
             </w:r>
           </w:p>
         </w:tc>
@@ -1756,7 +1756,7 @@
                 <w:i w:val="0"/>
                 <w:sz w:val="18"/>
               </w:rPr>
-              <w:t xml:space="preserve">Yes – the applicant and his wife are farmers; neither of them holds or held any Govt. job, nor is a civic volunteer or contractual staff</w:t>
+              <w:t xml:space="preserve">Yes – both are farmers</w:t>
             </w:r>
           </w:p>
         </w:tc>
@@ -1796,7 +1796,7 @@
                 <w:i w:val="0"/>
                 <w:sz w:val="18"/>
               </w:rPr>
-              <w:t xml:space="preserve">Applicant and spouse have not availed any benefit under FSSM/OTA-SFI/FMB/FMH/CHC during 2022-23 to 2025-26 (Cl. XI(d)(v))</w:t>
+              <w:t xml:space="preserve">No benefit under FSSM, OTA-SFI, FMB/FMH or CHC in 2022-23 to 2025-26 – applicant and spouse (Cl. XI(d)(v))</w:t>
             </w:r>
           </w:p>
         </w:tc>
@@ -1814,7 +1814,7 @@
                 <w:i w:val="0"/>
                 <w:sz w:val="18"/>
               </w:rPr>
-              <w:t xml:space="preserve">Yes – no benefit availed under any of these schemes during 2022-23 to 2025-26</w:t>
+              <w:t xml:space="preserve">Yes – no benefit taken</w:t>
             </w:r>
           </w:p>
         </w:tc>
@@ -1854,7 +1854,7 @@
                 <w:i w:val="0"/>
                 <w:sz w:val="18"/>
               </w:rPr>
-              <w:t xml:space="preserve">At least four types of machinery/implements from Annexure-IV; at most two tractors (Cl. XI(g)(i), (iv))</w:t>
+              <w:t xml:space="preserve">At least 4 types of machines from Annexure-IV; at most 2 tractors (Cl. XI(g))</w:t>
             </w:r>
           </w:p>
         </w:tc>
@@ -1872,7 +1872,7 @@
                 <w:i w:val="0"/>
                 <w:sz w:val="18"/>
               </w:rPr>
-              <w:t xml:space="preserve">4 types (one each); no tractor</w:t>
+              <w:t xml:space="preserve">Yes – 4 types; no tractor</w:t>
             </w:r>
           </w:p>
         </w:tc>
@@ -1912,7 +1912,7 @@
                 <w:i w:val="0"/>
                 <w:sz w:val="18"/>
               </w:rPr>
-              <w:t xml:space="preserve">Reservation: at least 22% of CHC benefits for Scheduled Caste and 7% for Scheduled Tribe applicants (Cl. XI(m)(iii))</w:t>
+              <w:t xml:space="preserve">At least 22% of CHC benefits go to SC and 7% to ST applicants (Cl. XI(m)(iii))</w:t>
             </w:r>
           </w:p>
         </w:tc>
@@ -1930,7 +1930,7 @@
                 <w:i w:val="0"/>
                 <w:sz w:val="18"/>
               </w:rPr>
-              <w:t xml:space="preserve">Applicant is Scheduled Caste (SC)</w:t>
+              <w:t xml:space="preserve">Applicant is SC</w:t>
             </w:r>
           </w:p>
         </w:tc>
@@ -2101,7 +2101,7 @@
                 <w:i w:val="0"/>
                 <w:sz w:val="18"/>
               </w:rPr>
-              <w:t xml:space="preserve">Sri Ramprasad Biswas, S/o Sudhir Biswas – individual farmer, 60 years, Scheduled Caste</w:t>
+              <w:t xml:space="preserve">Sri Ramprasad Biswas, S/o Sudhir Biswas – farmer, 60 years, Scheduled Caste</w:t>
             </w:r>
           </w:p>
         </w:tc>
@@ -2159,7 +2159,7 @@
                 <w:i w:val="0"/>
                 <w:sz w:val="18"/>
               </w:rPr>
-              <w:t xml:space="preserve">Proprietorship – individual entrepreneur</w:t>
+              <w:t xml:space="preserve">Proprietorship (individual)</w:t>
             </w:r>
           </w:p>
         </w:tc>
@@ -2217,7 +2217,7 @@
                 <w:i w:val="0"/>
                 <w:sz w:val="18"/>
               </w:rPr>
-              <w:t xml:space="preserve">New venture – the first Custom Hiring Centre of the applicant; farmer by occupation</w:t>
+              <w:t xml:space="preserve">New venture – his first CHC; a farmer by occupation</w:t>
             </w:r>
           </w:p>
         </w:tc>
@@ -2275,7 +2275,7 @@
                 <w:i w:val="0"/>
                 <w:sz w:val="18"/>
               </w:rPr>
-              <w:t xml:space="preserve">Credit Linked Subsidy Scheme for Rural Entrepreneurs to set up Custom Hiring Centres (CHC) of Farm Machinery – Farm Mechanization Scheme 2026-27 (Memo No. 780-AG-11030(11)/1/2024-NAB-SEC dated 05.08.2026); individual applicant; credit-linked back-ended capital subsidy; approval by the DLSC (TFO up to Rs 60 lakh)</w:t>
+              <w:t xml:space="preserve">Credit Linked Subsidy Scheme for Rural Entrepreneurs to set up CHCs – FMS 2026-27 (Memo No. 780-AG-11030(11)/1/2024-NAB-SEC, 05.08.2026); back-ended subsidy; approval by the DLSC</w:t>
             </w:r>
           </w:p>
         </w:tc>
@@ -2333,7 +2333,7 @@
                 <w:i w:val="0"/>
                 <w:sz w:val="18"/>
               </w:rPr>
-              <w:t xml:space="preserve">Vill. Dakshin Durgapur, P.O. Dakshin Durgapur, G.P. Deulbari Debipur, Block &amp; P.S. Kultali, Dist. South 24 Parganas, PIN 743349</w:t>
+              <w:t xml:space="preserve">Vill. &amp; P.O. Dakshin Durgapur, G.P. Deulbari Debipur, Block Kultali, Dist. South 24 Parganas, PIN 743349</w:t>
             </w:r>
           </w:p>
         </w:tc>
@@ -2391,7 +2391,7 @@
                 <w:i w:val="0"/>
                 <w:sz w:val="18"/>
               </w:rPr>
-              <w:t xml:space="preserve">Mouza Dakshin Durgapur, J.L. No. 37, Khatian No. 682, Dag No. 317, 2 decimal, Bastu; own land of the applicant</w:t>
+              <w:t xml:space="preserve">Own bastu land, 2 decimal – Mouza Dakshin Durgapur, J.L. No. 37, Khatian No. 682, Dag No. 317</w:t>
             </w:r>
           </w:p>
         </w:tc>
@@ -2449,7 +2449,7 @@
                 <w:i w:val="0"/>
                 <w:sz w:val="18"/>
               </w:rPr>
-              <w:t xml:space="preserve">Not ready – a new open machinery shed (mandatory, Cl. XI(e)(i)) will be built at the project site; latest estimate Rs 1,10,035, included in TFO</w:t>
+              <w:t xml:space="preserve">New open shed (mandatory) to be built – Rs 1,10,035, included in TFO</w:t>
             </w:r>
           </w:p>
         </w:tc>
@@ -2507,7 +2507,7 @@
                 <w:i w:val="0"/>
                 <w:sz w:val="18"/>
               </w:rPr>
-              <w:t>Combine harvester (self-propelled, track type), power weeder, brush cutter, hand seeding machine – one each</w:t>
+              <w:t xml:space="preserve">Combine harvester (track type), power weeder, brush cutter, hand seeding machine – one each</w:t>
             </w:r>
           </w:p>
         </w:tc>
@@ -2547,7 +2547,7 @@
                 <w:i w:val="0"/>
                 <w:sz w:val="18"/>
               </w:rPr>
-              <w:t xml:space="preserve">Service output (productive hours a year)</w:t>
+              <w:t xml:space="preserve">Service output (hours a year)</w:t>
             </w:r>
           </w:p>
         </w:tc>
@@ -2565,7 +2565,7 @@
                 <w:i w:val="0"/>
                 <w:sz w:val="18"/>
               </w:rPr>
-              <w:t xml:space="preserve">Combine harvester: 600 hours a year at full capacity (75 days × 8 hours) – 360 hours in Year I, rising to 480 hours from Year IV; small implements at full use: power weeder 150 hours, brush cutter 150 hours, hand seeding machine 50 days (FA-1)</w:t>
+              <w:t xml:space="preserve">Combine: 600 hours a year at full capacity (360 in Year I, 480 from Year IV). Power weeder and brush cutter: 150 hours each; seeder: 50 days (FA-1)</w:t>
             </w:r>
           </w:p>
         </w:tc>
@@ -2623,7 +2623,7 @@
                 <w:i w:val="0"/>
                 <w:sz w:val="18"/>
               </w:rPr>
-              <w:t xml:space="preserve">Harvest window of 75 days a year (Aman 50 + Boro 25) for the combine harvester; small implements in the kharif and rabi seasons (Section 8.1)</w:t>
+              <w:t xml:space="preserve">Combine: 75 days a year (Aman 50 + Boro 25); small implements in kharif and rabi (Section 8.1)</w:t>
             </w:r>
           </w:p>
         </w:tc>
@@ -2681,7 +2681,7 @@
                 <w:i w:val="0"/>
                 <w:sz w:val="18"/>
               </w:rPr>
-              <w:t>Rs 29,57,450 (Rs 29.57 lakh) = machinery Rs 27,89,515 + shed Rs 1,10,035 + AMC Rs 41,900 + insurance (first year) Rs 16,000</w:t>
+              <w:t xml:space="preserve">Rs 29,57,450 = machinery Rs 27,89,515 + shed Rs 1,10,035 + AMC for 18 months Rs 41,900 + insurance for 1 year Rs 16,000</w:t>
             </w:r>
           </w:p>
         </w:tc>
@@ -2739,7 +2739,7 @@
                 <w:i w:val="0"/>
                 <w:sz w:val="18"/>
               </w:rPr>
-              <w:t xml:space="preserve">Rs 11,15,636 = 37.72% of TFO (40% of the cost of each machine, the shed, the AMC and the insurance, subject to the machine-wise ceilings of Annexure-IV; the combine harvester is held to its ceiling of Rs 10,00,000) – within the individual limit of Rs 16.00 lakh or 40% of TFO, whichever is less (Cl. XI(e)(ii)); released in two halves to the Subsidy Reserve Fund (Cl. XI(k))</w:t>
+              <w:t xml:space="preserve">Rs 11,15,636 (37.72% of TFO) – 40% of each item within the Annexure-IV ceilings (combine capped at Rs 10,00,000); paid in two halves into the Subsidy Reserve Fund (Section 9.2)</w:t>
             </w:r>
           </w:p>
         </w:tc>
@@ -2797,7 +2797,7 @@
                 <w:i w:val="0"/>
                 <w:sz w:val="18"/>
               </w:rPr>
-              <w:t xml:space="preserve">Rs 7,39,362 (25% of TFO – the minimum under Cl. XI(e)(v)), deposited with the bank before the subsidy is released</w:t>
+              <w:t xml:space="preserve">Rs 7,39,362 (25% of TFO, the minimum) – deposited with the bank before the subsidy</w:t>
             </w:r>
           </w:p>
         </w:tc>
@@ -2855,7 +2855,7 @@
                 <w:i w:val="0"/>
                 <w:sz w:val="18"/>
               </w:rPr>
-              <w:t xml:space="preserve">Rs 11,02,452 with interest (the bank loan in the application) – repaid by the applicant; the bank also lends Rs 11,15,636 without interest against the subsidy (kept in the Subsidy Reserve Fund), so the total loan sanctioned is Rs 22,18,088 = TFO less margin (Annexure-IX; Section 9.3)</w:t>
+              <w:t xml:space="preserve">Rs 22,18,088 in all: Rs 11,02,452 with interest (repaid by the applicant) + Rs 11,15,636 without interest (covered by the subsidy) (Section 9.3)</w:t>
             </w:r>
           </w:p>
         </w:tc>
@@ -2913,7 +2913,7 @@
                 <w:i w:val="0"/>
                 <w:sz w:val="18"/>
               </w:rPr>
-              <w:t xml:space="preserve">State Bank of India, Kaikhali Branch (IFSC SBIN0008785) – a commercial bank (Cl. XI(b)); interest assumed at 9% p.a. (the AIF lending-rate cap), 6% p.a. net after the 3% AIF interest subvention</w:t>
+              <w:t xml:space="preserve">State Bank of India, Kaikhali Branch (IFSC SBIN0008785); interest 9% p.a., 6% net after the 3% AIF subvention</w:t>
             </w:r>
           </w:p>
         </w:tc>
@@ -2971,7 +2971,7 @@
                 <w:i w:val="0"/>
                 <w:sz w:val="18"/>
               </w:rPr>
-              <w:t xml:space="preserve">Yes – AIF benefit to be availed on the loan with interest: 3% p.a. interest subvention (Section 9.4)</w:t>
+              <w:t xml:space="preserve">Yes – 3% p.a. interest subvention (Section 9.4)</w:t>
             </w:r>
           </w:p>
         </w:tc>
@@ -3029,7 +3029,7 @@
                 <w:i w:val="0"/>
                 <w:sz w:val="18"/>
               </w:rPr>
-              <w:t xml:space="preserve">Deulbari Debipur G.P. first, then the other G.P.s of Kultali block listed in Section 6.1 – main crop paddy (Aman and Boro)</w:t>
+              <w:t xml:space="preserve">Deulbari Debipur G.P. first, then other G.P.s of Kultali (Section 6.1); paddy – Aman and Boro</w:t>
             </w:r>
           </w:p>
         </w:tc>
@@ -3087,7 +3087,7 @@
                 <w:i w:val="0"/>
                 <w:sz w:val="18"/>
               </w:rPr>
-              <w:t xml:space="preserve">CHC to be set up within 3 months of sanction or by 31 March 2027, whichever is earlier (Cl. XI(k)(xiii)); first full year of operation 2027-28 (Year I)</w:t>
+              <w:t xml:space="preserve">Within 3 months of sanction or by 31 March 2027, whichever is earlier; Year I = 2027-28</w:t>
             </w:r>
           </w:p>
         </w:tc>
@@ -3145,7 +3145,7 @@
                 <w:i w:val="0"/>
                 <w:sz w:val="18"/>
               </w:rPr>
-              <w:t>About 158 ha in Year I rising to about 211 ha a year from Year IV; about 634 to 845 hire bookings a year</w:t>
+              <w:t xml:space="preserve">About 158 ha (634 bookings) in Year I, rising to 211 ha (845 bookings) from Year IV</w:t>
             </w:r>
           </w:p>
         </w:tc>
@@ -3203,7 +3203,7 @@
                 <w:i w:val="0"/>
                 <w:sz w:val="18"/>
               </w:rPr>
-              <w:t xml:space="preserve">Combine operator and helper (seasonal, about 52 to 69 paid days each a year); the applicant runs the CHC himself</w:t>
+              <w:t xml:space="preserve">Combine operator and helper (seasonal, 52–69 paid days a year); the applicant runs the CHC himself</w:t>
             </w:r>
           </w:p>
         </w:tc>
@@ -3261,7 +3261,7 @@
                 <w:i w:val="0"/>
                 <w:sz w:val="18"/>
               </w:rPr>
-              <w:t xml:space="preserve">Net profit after tax Rs 1.47 lakh in Year I, rising to Rs 6.27 lakh in Year VII (FA-6); average DSCR 3.37 (FA-5); break-even at 48% of full capacity in Year I, against 60% planned (FA-9)</w:t>
+              <w:t xml:space="preserve">Profit after tax Rs 1.47 lakh in Year I, Rs 6.27 lakh in Year VII; average DSCR 3.37; break-even at 48% of capacity in Year I against 60% planned (FA-5, FA-6, FA-9)</w:t>
             </w:r>
           </w:p>
         </w:tc>
@@ -3306,7 +3306,7 @@
           <w:b w:val="0"/>
           <w:i w:val="0"/>
         </w:rPr>
-        <w:t xml:space="preserve">Farm mechanization raises production and productivity, makes farm operations timely and reduces the cost of cultivation. In Kultali block of South 24 Parganas, in the Sundarbans area, paddy is the main crop and most farmers are small and marginal. They cannot buy costly machines such as a combine harvester, and at harvest time labour is scarce and expensive. As a result, harvesting is delayed and the crop is exposed to rain, cyclones and shattering losses.</w:t>
+        <w:t xml:space="preserve">Farm machines make farm work timely, raise yields and cut costs. In Kultali block (Sundarbans area), paddy is the main crop and most farmers are small or marginal. They cannot buy costly machines like a combine harvester, and harvest labour is scarce and costly. So harvesting is delayed and crops are lost to rain, cyclones and shattering.</w:t>
       </w:r>
     </w:p>
     <w:p>
@@ -3318,7 +3318,7 @@
           <w:b w:val="0"/>
           <w:i w:val="0"/>
         </w:rPr>
-        <w:t xml:space="preserve">To address this, Sri Ramprasad Biswas, a farmer of Vill. Dakshin Durgapur, proposes to establish a Custom Hiring Centre (CHC) of farm machinery on his own bastu land in the village, to hire out machines to local farmers at reasonable charges with preference to small and marginal farmers, as intended under Cl. XI(c) of the FMS 2026-27 guideline.</w:t>
+        <w:t xml:space="preserve">Sri Ramprasad Biswas, a farmer of Dakshin Durgapur, will set up a Custom Hiring Centre (CHC) on his own bastu land. He will hire out machines at reasonable rates, small and marginal farmers first (Cl. XI(c)).</w:t>
       </w:r>
     </w:p>
     <w:p>
@@ -3330,7 +3330,7 @@
           <w:b w:val="0"/>
           <w:i w:val="0"/>
         </w:rPr>
-        <w:t xml:space="preserve">Paddy is grown in two seasons – Aman (kharif) and Boro (summer) – so the combine harvester has two harvest windows a year; pulses, oilseeds and vegetables give work for the small implements (Section 7.2).</w:t>
+        <w:t xml:space="preserve">Paddy is grown twice a year (Aman and Boro), so the combine has two harvest seasons. Pulses, oilseeds and vegetables give work to the small implements.</w:t>
       </w:r>
     </w:p>
     <w:p>
@@ -3352,7 +3352,7 @@
           <w:b w:val="0"/>
           <w:i w:val="0"/>
         </w:rPr>
-        <w:t xml:space="preserve">timely sowing, weeding and harvesting in the short windows between two crops;</w:t>
+        <w:t xml:space="preserve">timely sowing, weeding and harvesting between two crops;</w:t>
       </w:r>
     </w:p>
     <w:p>
@@ -3365,7 +3365,7 @@
           <w:b w:val="0"/>
           <w:i w:val="0"/>
         </w:rPr>
-        <w:t xml:space="preserve">higher productivity of land, labour and inputs, and a lower cost of cultivation;</w:t>
+        <w:t xml:space="preserve">higher yields and a lower cost of cultivation;</w:t>
       </w:r>
     </w:p>
     <w:p>
@@ -3378,7 +3378,7 @@
           <w:b w:val="0"/>
           <w:i w:val="0"/>
         </w:rPr>
-        <w:t xml:space="preserve">less dependence on scarce farm labour and less drudgery in farm work;</w:t>
+        <w:t xml:space="preserve">less dependence on scarce labour, and less drudgery;</w:t>
       </w:r>
     </w:p>
     <w:p>
@@ -3391,7 +3391,7 @@
           <w:b w:val="0"/>
           <w:i w:val="0"/>
         </w:rPr>
-        <w:t xml:space="preserve">lower harvest losses and better quality of the produce;</w:t>
+        <w:t xml:space="preserve">fewer harvest losses and better quality produce;</w:t>
       </w:r>
     </w:p>
     <w:p>
@@ -3404,7 +3404,7 @@
           <w:b w:val="0"/>
           <w:i w:val="0"/>
         </w:rPr>
-        <w:t xml:space="preserve">access to costly machines for small and marginal farmers, who cannot own them.</w:t>
+        <w:t xml:space="preserve">costly machines within reach of small and marginal farmers.</w:t>
       </w:r>
     </w:p>
     <w:p>
@@ -3438,7 +3438,7 @@
           <w:b w:val="0"/>
           <w:i w:val="0"/>
         </w:rPr>
-        <w:t>To give a combine harvester and small farm implements on hire to farmers at village level, with priority to small and marginal farmers.</w:t>
+        <w:t xml:space="preserve">To hire out a combine harvester and small implements in the village, small and marginal farmers first.</w:t>
       </w:r>
     </w:p>
     <w:p>
@@ -3477,7 +3477,7 @@
           <w:b w:val="0"/>
           <w:i w:val="0"/>
         </w:rPr>
-        <w:t xml:space="preserve">To create regular self-employment and income for the applicant, and seasonal jobs for local youth as operator and helper.</w:t>
+        <w:t xml:space="preserve">To give the applicant a regular income, and local youth seasonal jobs.</w:t>
       </w:r>
     </w:p>
     <w:p>
@@ -3704,7 +3704,7 @@
                 <w:i w:val="0"/>
                 <w:sz w:val="18"/>
               </w:rPr>
-              <w:t xml:space="preserve">Vill. Dakshin Durgapur, P.O. Dakshin Durgapur, G.P. Deulbari Debipur, Block &amp; P.S. Kultali, Dist. South 24 Parganas, PIN 743349</w:t>
+              <w:t xml:space="preserve">Vill. &amp; P.O. Dakshin Durgapur, G.P. Deulbari Debipur, Block &amp; P.S. Kultali, Dist. South 24 Parganas, PIN 743349</w:t>
             </w:r>
           </w:p>
         </w:tc>
@@ -4013,7 +4013,7 @@
                 <w:i w:val="0"/>
                 <w:sz w:val="18"/>
               </w:rPr>
-              <w:t xml:space="preserve">Bastu – eligible category under Cl. XI(d)(ii)</w:t>
+              <w:t xml:space="preserve">Bastu (eligible – Cl. XI(d)(ii))</w:t>
             </w:r>
           </w:p>
         </w:tc>
@@ -4299,7 +4299,7 @@
                 <w:i w:val="0"/>
                 <w:sz w:val="18"/>
               </w:rPr>
-              <w:t>Not ready – a new shed will be constructed at the project site</w:t>
+              <w:t xml:space="preserve">Not ready – a new shed will be built</w:t>
             </w:r>
           </w:p>
         </w:tc>
@@ -4357,7 +4357,7 @@
                 <w:i w:val="0"/>
                 <w:sz w:val="18"/>
               </w:rPr>
-              <w:t xml:space="preserve">Own open shed – mandatory for a CHC (Cl. XI(e)(i)) – to be built by the applicant on his own project land</w:t>
+              <w:t xml:space="preserve">Own open shed on his own land (mandatory – Cl. XI(e)(i))</w:t>
             </w:r>
           </w:p>
         </w:tc>
@@ -4417,28 +4417,7 @@
                 <w:sz w:val="18"/>
                 <w:highlight w:val="none"/>
               </w:rPr>
-              <w:t>Length: 30 ft Width: 20 ft Height: 12 ft</w:t>
-            </w:r>
-            <w:r>
-              <w:rPr>
-                <w:rFonts w:hint="default"/>
-                <w:b w:val="0"/>
-                <w:i w:val="0"/>
-                <w:sz w:val="18"/>
-                <w:highlight w:val="none"/>
-                <w:lang w:val="en-US"/>
-              </w:rPr>
-              <w:t xml:space="preserve"> -  </w:t>
-            </w:r>
-            <w:r>
-              <w:rPr>
-                <w:rFonts w:hint="default"/>
-                <w:b w:val="0"/>
-                <w:i w:val="0"/>
-                <w:sz w:val="18"/>
-                <w:highlight w:val="none"/>
-              </w:rPr>
-              <w:t>Covered area: 600 sq. ft.</w:t>
+              <w:t xml:space="preserve">30 ft long × 20 ft wide × 12 ft high; covered area 600 sq. ft.</w:t>
             </w:r>
           </w:p>
         </w:tc>
@@ -4496,7 +4475,7 @@
                 <w:i w:val="0"/>
                 <w:sz w:val="18"/>
               </w:rPr>
-              <w:t xml:space="preserve">Rs 1,10,035 (latest estimate) = 3.72% of TFO – within the 5% limit for shed cost (Rs 1,47,873) and the 10% limit for ancillary cost (Cl. XI(e)(iv)); vetted plan and estimate enclosed (Cl. XI(f), item 10)</w:t>
+              <w:t xml:space="preserve">Rs 1,10,035 = 3.72% of TFO (limit 5% – Cl. XI(e)(iv)); vetted estimate enclosed</w:t>
             </w:r>
           </w:p>
         </w:tc>
@@ -4612,7 +4591,7 @@
                 <w:i w:val="0"/>
                 <w:sz w:val="18"/>
               </w:rPr>
-              <w:t>To be built and completed before the machinery is delivered and jointly inspected</w:t>
+              <w:t xml:space="preserve">To be ready before the machines are delivered and inspected</w:t>
             </w:r>
           </w:p>
         </w:tc>
@@ -4630,7 +4609,7 @@
           <w:i/>
           <w:sz w:val="17"/>
         </w:rPr>
-        <w:t xml:space="preserve">The project site is the applicant's own bastu land in his home village, Dakshin Durgapur (G.P. Deulbari Debipur).</w:t>
+        <w:t xml:space="preserve">The site is the applicant's own land in his home village.</w:t>
       </w:r>
     </w:p>
     <w:p>
@@ -4667,7 +4646,7 @@
           <w:b w:val="0"/>
           <w:i w:val="0"/>
         </w:rPr>
-        <w:t xml:space="preserve">The CHC is in Deulbari Debipur G.P. of Kultali block (BDO, Kultali). It will serve the farmers of Deulbari Debipur G.P. first, with preference to small and marginal farmers, and then farmers of the other areas listed in the application: Gopalganj, Gurguria Bhubaneswari, Jalaberia-I, Jalaberia-II, Maipith Baikunthapur, Merigunj-I, Merigunj-II and Kundakhali Godabar G.P.s and Kultali Municipality.</w:t>
+        <w:t xml:space="preserve">The CHC is in Deulbari Debipur G.P., Kultali block. It will serve this G.P. first, with small and marginal farmers first. It will then serve Gopalganj, Gurguria Bhubaneswari, Jalaberia-I, Jalaberia-II, Maipith Baikunthapur, Merigunj-I, Merigunj-II and Kundakhali Godabar G.P.s and Kultali Municipality.</w:t>
       </w:r>
     </w:p>
     <w:tbl>
@@ -4810,7 +4789,7 @@
                 <w:i w:val="0"/>
                 <w:sz w:val="18"/>
               </w:rPr>
-              <w:t xml:space="preserve">Deulbari Debipur G.P. – Vill. Dakshin Durgapur (CHC site and the applicant's village), Deulbari Debipur, Katamari, Madhabpur and Shyamnagar</w:t>
+              <w:t xml:space="preserve">Dakshin Durgapur (CHC site), Deulbari Debipur, Katamari, Madhabpur and Shyamnagar (Deulbari Debipur G.P.)</w:t>
             </w:r>
           </w:p>
         </w:tc>
@@ -4868,7 +4847,7 @@
                 <w:i w:val="0"/>
                 <w:sz w:val="18"/>
               </w:rPr>
-              <w:t xml:space="preserve">The other G.P.s and areas of Kultali block listed above, after local demand is met; machines may also go to nearby blocks, but not outside West Bengal (Cl. XI(k)(xv))</w:t>
+              <w:t xml:space="preserve">The other areas above, after local demand is met; never outside West Bengal (Cl. XI(k)(xv))</w:t>
             </w:r>
           </w:p>
         </w:tc>
@@ -5577,7 +5556,7 @@
           <w:i/>
           <w:sz w:val="17"/>
         </w:rPr>
-        <w:t>Estimated field capacity of the combine harvester: 0.40 to 0.48 ha/hour. Area = hours × 0.44 ha/hour (average); at 0.40–0.48 ha/hour the area is 144–173 ha in Year I and 192–230 ha from Year IV. Bookings = area ÷ 0.25 ha; 75 days = Aman 50 + Boro 25.</w:t>
+        <w:t xml:space="preserve">Combine capacity: 0.40–0.48 ha/hour; 0.44 is used. Area = hours × 0.44 ha. One booking = 0.25 ha. 75 days = Aman 50 + Boro 25.</w:t>
       </w:r>
     </w:p>
     <w:p>
@@ -6210,7 +6189,7 @@
                 <w:i w:val="0"/>
                 <w:sz w:val="18"/>
               </w:rPr>
-              <w:t>About Rs 8,180 per ha (about Rs 1,100 per bigha) at 0.44 ha/hour (Rs 7,500–9,000 per ha at 0.48–0.40 ha/hour)</w:t>
+              <w:t xml:space="preserve">About Rs 8,180 per ha (Rs 1,100 per bigha)</w:t>
             </w:r>
           </w:p>
         </w:tc>
@@ -6463,7 +6442,7 @@
           <w:sz w:val="18"/>
           <w:szCs w:val="24"/>
         </w:rPr>
-        <w:t xml:space="preserve">Rates rise 3% a year; actual "reasonable charges" are fixed in consultation with the ADA (Block) and the Asstt. DA (Admn) of the sub-division (Annexure-V, item xiv) and shown on the signboard with contact details (Annexure-V, item xi).</w:t>
+        <w:t xml:space="preserve">Rates rise 3% a year. Final rates are fixed with the ADA (Block) and Asstt. DA (Admn) and shown on the signboard (Annexure-V).</w:t>
       </w:r>
     </w:p>
     <w:p>
@@ -6728,7 +6707,7 @@
                 <w:i w:val="0"/>
                 <w:sz w:val="17"/>
               </w:rPr>
-              <w:t xml:space="preserve">(Annexure-IV item 19(g): Combine Harvester (Track type) &gt; 6 feet cutter bar width)</w:t>
+              <w:t xml:space="preserve">(Annexure-IV item 19(g): track type, &gt; 6 ft cutter bar)</w:t>
             </w:r>
           </w:p>
         </w:tc>
@@ -6790,7 +6769,7 @@
                 <w:i w:val="0"/>
                 <w:sz w:val="17"/>
               </w:rPr>
-              <w:t>Self-propelled paddy combine harvester (track type); estimated field capacity 0.40–0.48 ha/hour</w:t>
+              <w:t xml:space="preserve">Track-type paddy combine; 0.40–0.48 ha/hour</w:t>
             </w:r>
           </w:p>
         </w:tc>
@@ -6899,7 +6878,7 @@
                 <w:i w:val="0"/>
                 <w:sz w:val="17"/>
               </w:rPr>
-              <w:t xml:space="preserve">(Annexure-IV item 6(c): Power Weeder, engine operated 5 BHP &amp; below 7.5 BHP)</w:t>
+              <w:t xml:space="preserve">(Annexure-IV item 6(c): 5 to below 7.5 BHP)</w:t>
             </w:r>
           </w:p>
         </w:tc>
@@ -6961,7 +6940,7 @@
                 <w:i w:val="0"/>
                 <w:sz w:val="17"/>
               </w:rPr>
-              <w:t>5.3 hp, 212 cc, petrol engine driven</w:t>
+              <w:t xml:space="preserve">5.3 hp, 212 cc petrol engine</w:t>
             </w:r>
           </w:p>
         </w:tc>
@@ -7070,7 +7049,7 @@
                 <w:i w:val="0"/>
                 <w:sz w:val="17"/>
               </w:rPr>
-              <w:t xml:space="preserve">(Annexure-IV item 46: Brush Cutter (electric/engine powered))</w:t>
+              <w:t xml:space="preserve">(Annexure-IV item 46)</w:t>
             </w:r>
           </w:p>
         </w:tc>
@@ -7132,7 +7111,7 @@
                 <w:i w:val="0"/>
                 <w:sz w:val="17"/>
               </w:rPr>
-              <w:t>52 cc, single cylinder, 2-stroke petrol engine</w:t>
+              <w:t xml:space="preserve">52 cc, 2-stroke petrol engine</w:t>
             </w:r>
           </w:p>
         </w:tc>
@@ -7241,7 +7220,7 @@
                 <w:i w:val="0"/>
                 <w:sz w:val="17"/>
               </w:rPr>
-              <w:t xml:space="preserve">(Annexure-IV item 35: Hand Seedling Machine)</w:t>
+              <w:t xml:space="preserve">(Annexure-IV item 35)</w:t>
             </w:r>
           </w:p>
         </w:tc>
@@ -7303,7 +7282,7 @@
                 <w:i w:val="0"/>
                 <w:sz w:val="17"/>
               </w:rPr>
-              <w:t>Manually operated</w:t>
+              <w:t xml:space="preserve">Manually operated</w:t>
             </w:r>
           </w:p>
         </w:tc>
@@ -7630,7 +7609,7 @@
                 <w:i w:val="0"/>
                 <w:sz w:val="17"/>
               </w:rPr>
-              <w:t xml:space="preserve">Add: AMC – paid upfront to the dealer, 18 months (Section 8.3)</w:t>
+              <w:t xml:space="preserve">Add: AMC for 18 months, paid upfront (Section 8.3)</w:t>
             </w:r>
           </w:p>
         </w:tc>
@@ -7746,7 +7725,7 @@
                 <w:i w:val="0"/>
                 <w:sz w:val="17"/>
               </w:rPr>
-              <w:t>Add: insurance of the machinery – first year (Section 8.3)</w:t>
+              <w:t xml:space="preserve">Add: insurance, first year (Section 8.3)</w:t>
             </w:r>
           </w:p>
         </w:tc>
@@ -7856,7 +7835,7 @@
                 <w:i w:val="0"/>
                 <w:sz w:val="17"/>
               </w:rPr>
-              <w:t>Total Financial Outlay (TFO) = machinery + shed + AMC + insurance</w:t>
+              <w:t xml:space="preserve">Total Financial Outlay (TFO)</w:t>
             </w:r>
           </w:p>
         </w:tc>
@@ -8095,7 +8074,7 @@
                 <w:i w:val="0"/>
                 <w:sz w:val="17"/>
               </w:rPr>
-              <w:t>Reaping, threshing and cleaning of paddy in one pass (Aman and Boro)</w:t>
+              <w:t xml:space="preserve">Reaps, threshes and cleans paddy in one pass</w:t>
             </w:r>
           </w:p>
         </w:tc>
@@ -8113,7 +8092,7 @@
                 <w:i w:val="0"/>
                 <w:sz w:val="17"/>
               </w:rPr>
-              <w:t xml:space="preserve">Removes the harvest-labour bottleneck, so mature paddy is less exposed to rain, cyclones and shattering. Track type for soft, wet fields. One unit matches the 75-day window (600 hours at 8 h/day).</w:t>
+              <w:t xml:space="preserve">Solves the harvest-labour shortage and cuts crop loss. Track type suits wet fields. One unit covers the 75-day season (600 hours).</w:t>
             </w:r>
           </w:p>
         </w:tc>
@@ -8171,7 +8150,7 @@
                 <w:i w:val="0"/>
                 <w:sz w:val="17"/>
               </w:rPr>
-              <w:t>Weeding / inter-cultivation and light soil working in small plots</w:t>
+              <w:t xml:space="preserve">Weeding and light tillage in small plots</w:t>
             </w:r>
           </w:p>
         </w:tc>
@@ -8189,7 +8168,7 @@
                 <w:i w:val="0"/>
                 <w:sz w:val="17"/>
               </w:rPr>
-              <w:t xml:space="preserve">Cuts manual weeding labour and cost; 5.3 hp suits small plots; 150 hours a year at full use. Scope: vegetables and other upland crops in the service area.</w:t>
+              <w:t xml:space="preserve">Saves weeding labour and cost; for vegetables and upland crops; 150 hours a year at full use.</w:t>
             </w:r>
           </w:p>
         </w:tc>
@@ -8247,7 +8226,7 @@
                 <w:i w:val="0"/>
                 <w:sz w:val="17"/>
               </w:rPr>
-              <w:t>Cutting weeds and grass on bunds, field boundaries and channels; cutting fodder and crop residue</w:t>
+              <w:t xml:space="preserve">Cuts weeds and grass on bunds and channels, and fodder and crop residue</w:t>
             </w:r>
           </w:p>
         </w:tc>
@@ -8265,7 +8244,7 @@
                 <w:i w:val="0"/>
                 <w:sz w:val="17"/>
               </w:rPr>
-              <w:t>Low-cost and portable; keeps bunds and channels clean before sowing or transplanting; 150 hours a year at full use.</w:t>
+              <w:t xml:space="preserve">Low-cost and portable; keeps bunds clean before sowing; 150 hours a year at full use.</w:t>
             </w:r>
           </w:p>
         </w:tc>
@@ -8323,7 +8302,7 @@
                 <w:i w:val="0"/>
                 <w:sz w:val="17"/>
               </w:rPr>
-              <w:t>Line sowing of seed at uniform spacing and depth</w:t>
+              <w:t xml:space="preserve">Line sowing at even spacing and depth</w:t>
             </w:r>
           </w:p>
         </w:tc>
@@ -8341,7 +8320,7 @@
                 <w:i w:val="0"/>
                 <w:sz w:val="17"/>
               </w:rPr>
-              <w:t xml:space="preserve">Saves seed and sowing labour over broadcasting; manual, no fuel; 50 days a year at full use. Scope: line sowing of pulses, oilseeds and vegetables in the service area.</w:t>
+              <w:t xml:space="preserve">Saves seed and labour; manual, no fuel; for pulses, oilseeds and vegetables; 50 days a year at full use.</w:t>
             </w:r>
           </w:p>
         </w:tc>
@@ -8359,7 +8338,7 @@
           <w:i/>
           <w:sz w:val="17"/>
         </w:rPr>
-        <w:t xml:space="preserve">Together the four machines cover sowing (hand seeding machine), weeding and light tillage (power weeder), harvesting and threshing (combine harvester) and cutting of weeds, fodder and crop residue (brush cutter) – the end-to-end use of farm machinery sought for a CHC (Cl. XI(c)(i), XI(g)(iv)).</w:t>
+        <w:t xml:space="preserve">The four machines cover sowing, weeding, harvesting and residue cutting – the end-to-end use a CHC needs (Cl. XI(c)(i)).</w:t>
       </w:r>
     </w:p>
     <w:p>
@@ -8567,7 +8546,7 @@
               <w:rPr>
                 <w:sz w:val="17"/>
               </w:rPr>
-              <w:t>Boro paddy harvest (local and nearby blocks within West Bengal)</w:t>
+              <w:t xml:space="preserve">Boro paddy harvest (local and nearby blocks)</w:t>
             </w:r>
           </w:p>
         </w:tc>
@@ -8668,7 +8647,7 @@
               <w:rPr>
                 <w:sz w:val="17"/>
               </w:rPr>
-              <w:t>Power weeder and hand seeder in kharif vegetables and line-sown crops</w:t>
+              <w:t xml:space="preserve">Power weeder and seeder – kharif crops</w:t>
             </w:r>
           </w:p>
         </w:tc>
@@ -8826,7 +8805,7 @@
               <w:rPr>
                 <w:sz w:val="17"/>
               </w:rPr>
-              <w:t>Power weeder and hand seeder in rabi vegetables</w:t>
+              <w:t xml:space="preserve">Power weeder and seeder – rabi vegetables</w:t>
             </w:r>
           </w:p>
         </w:tc>
@@ -9415,7 +9394,7 @@
           <w:i/>
           <w:sz w:val="17"/>
         </w:rPr>
-        <w:t xml:space="preserve">Paid days = working days + 15% for travel and standby, rounded to whole days; wages rise 5% a year. The applicant manages the CHC himself and draws no salary; the small implements are operated by him or by local workers paid only for that work, within their running cost.</w:t>
+        <w:t xml:space="preserve">Paid days = working days + 15% for travel and standby. Wages rise 5% a year. The applicant runs the CHC and takes no salary. Small implements are run by him or by local workers paid per job.</w:t>
       </w:r>
     </w:p>
     <w:p>
@@ -9440,7 +9419,7 @@
           <w:b w:val="0"/>
           <w:i w:val="0"/>
         </w:rPr>
-        <w:t>Annual Maintenance Contract (AMC) with the dealer: Rs 73,900 for the first 30 months (Rs 29,560 a year in Years I–II and Rs 14,780 for the first 6 months of Year III); renewal at Rs 40,000 a year from month 31 (Rs 20,000 in Year III), rising 5% a year from Year V. Rs 41,900 of the AMC is included in the TFO and paid upfront to the dealer (it covers the Year I charge of Rs 29,560 and Rs 12,340 of Year II); the balance of Rs 32,000 and the renewals are paid from hire income.</w:t>
+        <w:t xml:space="preserve">AMC: Rs 41,900 for the first 18 months, paid upfront from the TFO (Rs 27,933 in Year I, Rs 13,967 in Year II). After that it is renewed from hire income at Rs 40,000 a year, rising 5% a year from Year V.</w:t>
       </w:r>
     </w:p>
     <w:p>
@@ -9453,7 +9432,7 @@
           <w:b w:val="0"/>
           <w:i w:val="0"/>
         </w:rPr>
-        <w:t>Repairs and spares (one row, apart from the AMC): worked out by the Indian Standard IS 9164:1979 (BIS) from the hours each machine works, so the cost rises as the machines get older. The AMC is part of this maintenance cost, so it is deducted and not counted twice (details under FA-2).</w:t>
+        <w:t xml:space="preserve">Repairs and spares follow IS 9164 (BIS), so the cost rises with the hours worked. The AMC is part of this cost and is not counted twice (FA-2).</w:t>
       </w:r>
     </w:p>
     <w:p>
@@ -9466,7 +9445,7 @@
           <w:b w:val="0"/>
           <w:i w:val="0"/>
         </w:rPr>
-        <w:t>Insurance of the machinery: Rs 16,000 for one year; renewed every year and taken at Rs 16,000 a year. The first year's premium (Rs 16,000) is included in the TFO and paid upfront; the renewals from Year II are paid from hire income.</w:t>
+        <w:t xml:space="preserve">Insurance: Rs 16,000 a year. Year I is paid from the TFO; later years from hire income.</w:t>
       </w:r>
     </w:p>
     <w:p>
@@ -9479,7 +9458,7 @@
           <w:b w:val="0"/>
           <w:i w:val="0"/>
         </w:rPr>
-        <w:t>Pre-season servicing before each harvest; the machines are parked under the shed when not in use.</w:t>
+        <w:t xml:space="preserve">Servicing before each harvest; machines are kept under the shed when idle.</w:t>
       </w:r>
     </w:p>
     <w:p>
@@ -9491,7 +9470,7 @@
           <w:b w:val="0"/>
           <w:i w:val="0"/>
         </w:rPr>
-        <w:t xml:space="preserve">8.4 Display, records and use of the machines</w:t>
+        <w:t xml:space="preserve">8.4 Signboard, records and use of machines</w:t>
       </w:r>
     </w:p>
     <w:p>
@@ -9504,7 +9483,7 @@
           <w:b w:val="0"/>
           <w:i w:val="0"/>
         </w:rPr>
-        <w:t xml:space="preserve">A permanent signboard at the CHC (name of the CHC and its proprietor, year of financing, subsidy, financing bank and credit received, hire rates and contact details), a metal plate on each machine, a money receipt or cash/credit memo to every user and a hire register (Cl. XI(k)(xvi)–(xviii); Annexure-V, items vii, xi and xiii).</w:t>
+        <w:t xml:space="preserve">A signboard with the CHC name, owner, year of financing, subsidy, bank loan, hire rates and phone number; a metal plate on each machine; a receipt for every user; and a hire register (Cl. XI(k)(xvi)–(xviii)).</w:t>
       </w:r>
     </w:p>
     <w:p>
@@ -9517,7 +9496,7 @@
           <w:b w:val="0"/>
           <w:i w:val="0"/>
         </w:rPr>
-        <w:t xml:space="preserve">Machines are hired out to all farmers, small and marginal farmers first; they may go to nearby blocks or districts after local demand is met, but never outside West Bengal (Cl. XI(k)(xv)). The CHC will not be sold, leased or mortgaged within 6 years (Cl. XI(j)(iii), (vii)).</w:t>
+        <w:t xml:space="preserve">Machines go to nearby blocks or districts only after local demand is met, and never outside West Bengal (Cl. XI(k)(xv)). The CHC will not be sold, leased or mortgaged for 6 years (Cl. XI(j)(iii)).</w:t>
       </w:r>
     </w:p>
     <w:p>
@@ -9768,7 +9747,7 @@
                 <w:i w:val="0"/>
                 <w:sz w:val="18"/>
               </w:rPr>
-              <w:t>Cost of shed (new open machinery shed, to be built – Section 5.2)</w:t>
+              <w:t xml:space="preserve">Open shed, to be built (Section 5.2)</w:t>
             </w:r>
           </w:p>
         </w:tc>
@@ -9805,7 +9784,7 @@
                 <w:i w:val="0"/>
                 <w:sz w:val="18"/>
               </w:rPr>
-              <w:t xml:space="preserve">3.72% of TFO – within the 5% limit for shed cost (Rs 1,47,873) and the 10% limit for ancillary cost (Cl. XI(e)(iv)); open shed is mandatory (Cl. XI(e)(i)); vetted plan and estimate enclosed (Cl. XI(f), item 10)</w:t>
+              <w:t xml:space="preserve">3.72% of TFO (limit 5%); mandatory; vetted estimate enclosed</w:t>
             </w:r>
           </w:p>
         </w:tc>
@@ -9883,7 +9862,7 @@
                 <w:i w:val="0"/>
                 <w:sz w:val="18"/>
               </w:rPr>
-              <w:t>Included; paid upfront to the dealer – part of the AMC of Rs 73,900 for 30 months (covers the Year I charge of Rs 29,560 and Rs 12,340 of Year II); the balance of Rs 32,000 and the renewals are paid from hire income</w:t>
+              <w:t xml:space="preserve">For 18 months; paid upfront to the dealer; renewals from hire income</w:t>
             </w:r>
           </w:p>
         </w:tc>
@@ -9961,7 +9940,7 @@
                 <w:i w:val="0"/>
                 <w:sz w:val="18"/>
               </w:rPr>
-              <w:t>Included; comprehensive insurance of the machinery for the first year (Year I); renewals from Year II (Rs 16,000 a year) are paid from hire income</w:t>
+              <w:t xml:space="preserve">First year, comprehensive; renewals from hire income</w:t>
             </w:r>
           </w:p>
         </w:tc>
@@ -10041,7 +10020,7 @@
                 <w:i w:val="0"/>
                 <w:sz w:val="18"/>
               </w:rPr>
-              <w:t xml:space="preserve">Rs 29.57 lakh – within the CHC range of Rs 20.00 lakh to the SMAM maximum (Cl. XI(e)(ii)); assistance @40% of TFO subject to machine-wise ceilings (Cl. XI(e)(i)); shed + AMC + insurance Rs 1,67,935 = 5.68% of TFO, within the 10% limit for ancillary cost (Cl. XI(e)(iv))</w:t>
+              <w:t xml:space="preserve">Above the Rs 20 lakh minimum; shed + AMC + insurance = 5.68% of TFO (limit 10%)</w:t>
             </w:r>
           </w:p>
         </w:tc>
@@ -11684,7 +11663,7 @@
                 <w:sz w:val="19"/>
                 <w:szCs w:val="19"/>
               </w:rPr>
-              <w:t xml:space="preserve">AMC (paid upfront)</w:t>
+              <w:t xml:space="preserve">AMC (18 months, paid upfront)</w:t>
             </w:r>
           </w:p>
         </w:tc>
@@ -12352,7 +12331,7 @@
           <w:i/>
           <w:sz w:val="17"/>
         </w:rPr>
-        <w:t xml:space="preserve">Each machine: 40% of cost or its Annexure-IV ceiling, whichever is less (rounded down to the rupee, as on the portal); the combine harvester is held to its ceiling of Rs 10,00,000. Total Rs 11,15,636 = 37.72% of TFO – within the individual limit of Rs 16.00 lakh or 40% of TFO (Rs 11,82,980), whichever is less, and above the minimum subsidy of Rs 8.00 lakh (Cl. V(3), XI(d)(i), XI(e)(ii)).</w:t>
+        <w:t xml:space="preserve">Subsidy = 40% of cost or the Annexure-IV ceiling, whichever is less (combine capped at Rs 10,00,000). The total is within the individual limit (40% of TFO = Rs 11,82,980) and above the Rs 8 lakh minimum.</w:t>
       </w:r>
     </w:p>
     <w:p>
@@ -12549,7 +12528,7 @@
                 <w:i w:val="0"/>
                 <w:sz w:val="18"/>
               </w:rPr>
-              <w:t xml:space="preserve">Applicant's margin money (minimum 25% of TFO, Cl. XI(e)(v))</w:t>
+              <w:t xml:space="preserve">Margin money (minimum 25%)</w:t>
             </w:r>
           </w:p>
         </w:tc>
@@ -12645,7 +12624,7 @@
                 <w:i w:val="0"/>
                 <w:sz w:val="18"/>
               </w:rPr>
-              <w:t xml:space="preserve">Total bank term loan sanctioned (TFO less margin, Cl. XIII(3)) – State Bank of India, Kaikhali Branch, under AIF (Section 9.4)</w:t>
+              <w:t xml:space="preserve">Bank term loan – SBI, Kaikhali Branch (TFO less margin)</w:t>
             </w:r>
           </w:p>
         </w:tc>
@@ -12733,7 +12712,7 @@
                 <w:i w:val="0"/>
                 <w:sz w:val="18"/>
               </w:rPr>
-              <w:t xml:space="preserve">  (a) loan without interest (Annexure-IX, item 7) – backed by the Govt. subsidy kept in the Subsidy Reserve Fund (SRF), locked in for 5 years</w:t>
+              <w:t xml:space="preserve">  (a) Loan without interest – covered by the subsidy</w:t>
             </w:r>
           </w:p>
         </w:tc>
@@ -12821,7 +12800,7 @@
                 <w:i w:val="0"/>
                 <w:sz w:val="18"/>
               </w:rPr>
-              <w:t xml:space="preserve">  (b) loan with interest (Annexure-IX, item 8) – the bank loan in the application, repaid by the applicant (9% p.a. less 3% AIF subvention = 6% p.a. net)</w:t>
+              <w:t xml:space="preserve">  (b) Loan with interest – repaid by the applicant (6% net)</w:t>
             </w:r>
           </w:p>
         </w:tc>
@@ -12969,7 +12948,7 @@
           <w:i/>
           <w:sz w:val="17"/>
         </w:rPr>
-        <w:t xml:space="preserve">The subsidy goes to the Subsidy Reserve Fund in two halves – 50% (Rs 5,57,818) as advance after the loan is sanctioned and the margin money deposited, and 50% (Rs 5,57,818) after joint inspection and geo-tagging of the machines (Cl. XI(k)(vi), (x), (xi)). It stays locked in for 5 years and is adjusted after the loan with interest is repaid; interest is charged only on the loan with interest (Cl. XI(j)(ii), (iv); XIII(3), (5)).</w:t>
+        <w:t xml:space="preserve">The subsidy goes into the Subsidy Reserve Fund in two halves of Rs 5,57,818: after loan sanction and margin deposit, and after joint inspection and geo-tagging. It is locked in for 5 years, then set off against the loan without interest. Interest is charged only on the loan with interest.</w:t>
       </w:r>
     </w:p>
     <w:p>
@@ -12981,7 +12960,7 @@
           <w:b w:val="0"/>
           <w:i w:val="0"/>
         </w:rPr>
-        <w:t xml:space="preserve">9.4 Convergence with the Agriculture Infrastructure Fund (AIF)</w:t>
+        <w:t xml:space="preserve">9.4 Agriculture Infrastructure Fund (AIF)</w:t>
       </w:r>
     </w:p>
     <w:p>
@@ -12994,7 +12973,7 @@
           <w:b w:val="0"/>
           <w:i w:val="0"/>
         </w:rPr>
-        <w:t xml:space="preserve">A Custom Hiring Centre with at least 4 farm machines/implements is an eligible project under AIF, and the FMS feasibility report records AIF convergence (Annexure-XIV, item 10); this CHC has 4 machines, including a combine harvester.</w:t>
+        <w:t xml:space="preserve">A CHC with at least 4 machines is eligible under AIF; this CHC has 4.</w:t>
       </w:r>
     </w:p>
     <w:p>
@@ -13007,7 +12986,7 @@
           <w:b w:val="0"/>
           <w:i w:val="0"/>
         </w:rPr>
-        <w:t xml:space="preserve">AIF gives an interest subvention of 3% p.a. on loans up to Rs 2 crore for a maximum of 7 years, and credit-guarantee cover through CGTMSE for eligible borrowers.</w:t>
+        <w:t xml:space="preserve">AIF gives 3% p.a. interest subvention on loans up to Rs 2 crore for up to 7 years, plus CGTMSE credit guarantee.</w:t>
       </w:r>
     </w:p>
     <w:p>
@@ -13020,7 +12999,7 @@
           <w:b w:val="0"/>
           <w:i w:val="0"/>
         </w:rPr>
-        <w:t xml:space="preserve">Repayment under AIF can be up to 7 years including a moratorium of up to 2 years; this project follows the FMS rule of one grace year and repayment within 5 years (Cl. XI(j)(ii); XIII(6)(e)) – 10 half-yearly instalments in Years II–VI (FA-4).</w:t>
+        <w:t xml:space="preserve">Repayment follows the FMS rule: 1 grace year, then 5 years in 10 half-yearly instalments (FA-4).</w:t>
       </w:r>
     </w:p>
     <w:p>
@@ -13053,7 +13032,7 @@
           <w:b w:val="0"/>
           <w:i w:val="0"/>
         </w:rPr>
-        <w:t xml:space="preserve">10.1 Total Financial Outlay and expected annual return (Annexure-VIII, items 16 and 17)</w:t>
+        <w:t xml:space="preserve">10.1 TFO and expected annual return (Annexure-VIII)</w:t>
       </w:r>
     </w:p>
     <w:tbl>
@@ -13189,7 +13168,7 @@
                 <w:i w:val="0"/>
                 <w:sz w:val="17"/>
               </w:rPr>
-              <w:t>Basis / where to verify</w:t>
+              <w:t xml:space="preserve">Basis</w:t>
             </w:r>
           </w:p>
         </w:tc>
@@ -13299,7 +13278,7 @@
                 <w:i w:val="0"/>
                 <w:sz w:val="17"/>
               </w:rPr>
-              <w:t>Machinery Rs 27,89,515 + new open shed Rs 1,10,035 + AMC Rs 41,900 + first-year insurance Rs 16,000 (Section 9.1)</w:t>
+              <w:t xml:space="preserve">Machinery + shed + AMC + insurance (Section 9.1)</w:t>
             </w:r>
           </w:p>
         </w:tc>
@@ -13409,7 +13388,7 @@
                 <w:i w:val="0"/>
                 <w:sz w:val="17"/>
               </w:rPr>
-              <w:t>Hire income in 2027-28 at 60% utilisation: combine Rs 12,96,000 + small implements Rs 39,000 (Section 10.2)</w:t>
+              <w:t xml:space="preserve">Hire income at 60% use (Section 10.2)</w:t>
             </w:r>
           </w:p>
         </w:tc>
@@ -13519,7 +13498,7 @@
                 <w:i w:val="0"/>
                 <w:sz w:val="17"/>
               </w:rPr>
-              <w:t>Operating costs: fuel and lubricants, operator and helper, shifting, small implements, repairs and spares, AMC, insurance, miscellaneous (Section 10.4); AMC and insurance at full cost, of which Rs 45,560 is already paid from the TFO (Section 10.3)</w:t>
+              <w:t xml:space="preserve">Operating costs (Section 10.4)</w:t>
             </w:r>
           </w:p>
         </w:tc>
@@ -13633,7 +13612,7 @@
                 <w:i w:val="0"/>
                 <w:sz w:val="17"/>
               </w:rPr>
-              <w:t xml:space="preserve">Before interest Rs 66,147 (net of the 3% AIF subvention), depreciation Rs 4,29,431 and income tax (nil) (Section 10.3)</w:t>
+              <w:t xml:space="preserve">Before interest, depreciation and tax (Section 10.3)</w:t>
             </w:r>
           </w:p>
         </w:tc>
@@ -14467,7 +14446,7 @@
                 <w:i w:val="0"/>
                 <w:sz w:val="18"/>
               </w:rPr>
-              <w:t>Operating expenditure (fuel and lubricants, operator and helper, shifting, small-implement running, repairs and spares, AMC, insurance, miscellaneous)</w:t>
+              <w:t xml:space="preserve">Operating expenditure (Section 10.4)</w:t>
             </w:r>
           </w:p>
         </w:tc>
@@ -14663,7 +14642,7 @@
                 <w:i w:val="0"/>
                 <w:sz w:val="18"/>
               </w:rPr>
-              <w:t>Interest on bank loan (6% p.a. net, after 3% AIF subvention)</w:t>
+              <w:t xml:space="preserve">Interest on the loan (6% net)</w:t>
             </w:r>
           </w:p>
         </w:tc>
@@ -14951,7 +14930,7 @@
                 <w:i w:val="0"/>
                 <w:sz w:val="18"/>
               </w:rPr>
-              <w:t xml:space="preserve">Income tax (projected – nil after the rebate, FA-3)</w:t>
+              <w:t xml:space="preserve">Income tax (nil – FA-3)</w:t>
             </w:r>
           </w:p>
         </w:tc>
@@ -15147,7 +15126,7 @@
                 <w:i w:val="0"/>
                 <w:sz w:val="18"/>
               </w:rPr>
-              <w:t>Add: AMC and insurance paid upfront from TFO (included in B; no cash outflow in the year)</w:t>
+              <w:t xml:space="preserve">Add: AMC and insurance already paid from TFO</w:t>
             </w:r>
           </w:p>
         </w:tc>
@@ -15166,7 +15145,7 @@
                 <w:i w:val="0"/>
                 <w:sz w:val="18"/>
               </w:rPr>
-              <w:t xml:space="preserve">45,560</w:t>
+              <w:t xml:space="preserve">43,933</w:t>
             </w:r>
           </w:p>
         </w:tc>
@@ -15262,7 +15241,7 @@
                 <w:i w:val="0"/>
                 <w:sz w:val="18"/>
               </w:rPr>
-              <w:t xml:space="preserve">6,22,189</w:t>
+              <w:t xml:space="preserve">6,20,562</w:t>
             </w:r>
           </w:p>
         </w:tc>
@@ -15457,7 +15436,7 @@
                 <w:i w:val="0"/>
                 <w:sz w:val="18"/>
               </w:rPr>
-              <w:t xml:space="preserve">6,22,189</w:t>
+              <w:t xml:space="preserve">6,20,562</w:t>
             </w:r>
           </w:p>
         </w:tc>
@@ -15494,7 +15473,7 @@
           <w:b w:val="0"/>
           <w:i w:val="0"/>
         </w:rPr>
-        <w:t xml:space="preserve">For the application form (Annexure-VIII): item 13 – area of operation about 158 ha in Year I, rising to about 211 ha a year from Year IV; item 14 – combine harvester, power weeder, brush cutter and hand seeding machine; item 16 – TFO Rs 29,57,450; item 17 (Year I) – (a) gross annual income Rs 13,35,000, (b) total expenditure Rs 6,92,224, (c) net income Rs 6,42,776. Year-wise projections for Years I–VII are in Part B: profit and loss account (FA-6), cash flow (FA-7), balance sheet with key ratios (FA-8) and break-even analysis (FA-9).</w:t>
+        <w:t xml:space="preserve">For the application form (Annexure-VIII): area 158 ha in Year I and 211 ha from Year IV; TFO Rs 29,57,450; Year I income Rs 13,35,000, expenditure Rs 6,92,224, net income Rs 6,42,776. Year-wise accounts are in Part B (FA-6 to FA-9).</w:t>
       </w:r>
     </w:p>
     <w:p>
@@ -15795,7 +15774,7 @@
                 <w:i w:val="0"/>
                 <w:sz w:val="17"/>
               </w:rPr>
-              <w:t>3,09,600</w:t>
+              <w:t xml:space="preserve">3,09,600</w:t>
             </w:r>
           </w:p>
         </w:tc>
@@ -15814,7 +15793,7 @@
                 <w:i w:val="0"/>
                 <w:sz w:val="17"/>
               </w:rPr>
-              <w:t>1,50,800</w:t>
+              <w:t xml:space="preserve">1,50,800</w:t>
             </w:r>
           </w:p>
         </w:tc>
@@ -15833,7 +15812,7 @@
                 <w:i w:val="0"/>
                 <w:sz w:val="17"/>
               </w:rPr>
-              <w:t>45,424</w:t>
+              <w:t xml:space="preserve">45,424</w:t>
             </w:r>
           </w:p>
         </w:tc>
@@ -15852,7 +15831,7 @@
                 <w:i w:val="0"/>
                 <w:sz w:val="17"/>
               </w:rPr>
-              <w:t>28,545</w:t>
+              <w:t xml:space="preserve">28,545</w:t>
             </w:r>
           </w:p>
         </w:tc>
@@ -15871,7 +15850,7 @@
                 <w:i w:val="0"/>
                 <w:sz w:val="17"/>
               </w:rPr>
-              <w:t>54,295</w:t>
+              <w:t xml:space="preserve">55,922</w:t>
             </w:r>
           </w:p>
         </w:tc>
@@ -15890,7 +15869,7 @@
                 <w:i w:val="0"/>
                 <w:sz w:val="17"/>
               </w:rPr>
-              <w:t>29,560</w:t>
+              <w:t xml:space="preserve">27,933</w:t>
             </w:r>
           </w:p>
         </w:tc>
@@ -15909,7 +15888,7 @@
                 <w:i w:val="0"/>
                 <w:sz w:val="17"/>
               </w:rPr>
-              <w:t>16,000</w:t>
+              <w:t xml:space="preserve">16,000</w:t>
             </w:r>
           </w:p>
         </w:tc>
@@ -15928,7 +15907,7 @@
                 <w:i w:val="0"/>
                 <w:sz w:val="17"/>
               </w:rPr>
-              <w:t>58,000</w:t>
+              <w:t xml:space="preserve">58,000</w:t>
             </w:r>
           </w:p>
         </w:tc>
@@ -15947,7 +15926,7 @@
                 <w:i w:val="0"/>
                 <w:sz w:val="17"/>
               </w:rPr>
-              <w:t>6,92,224</w:t>
+              <w:t xml:space="preserve">6,92,224</w:t>
             </w:r>
           </w:p>
         </w:tc>
@@ -16139,46 +16118,46 @@
                 <w:i w:val="0"/>
                 <w:sz w:val="18"/>
               </w:rPr>
-              <w:t xml:space="preserve">1. The applicant is a farmer of the same village and knows the local farmers and their needs.</w:t>
-            </w:r>
-          </w:p>
-          <w:p>
-            <w:pPr>
-              <w:spacing w:before="0" w:after="0" w:line="240" w:lineRule="auto"/>
-            </w:pPr>
-            <w:r>
-              <w:rPr>
-                <w:b w:val="0"/>
-                <w:i w:val="0"/>
-                <w:sz w:val="18"/>
-              </w:rPr>
-              <w:t xml:space="preserve">2. Paddy is the main crop, so combine harvesting is in demand in both Aman and Boro seasons.</w:t>
-            </w:r>
-          </w:p>
-          <w:p>
-            <w:pPr>
-              <w:spacing w:before="0" w:after="0" w:line="240" w:lineRule="auto"/>
-            </w:pPr>
-            <w:r>
-              <w:rPr>
-                <w:b w:val="0"/>
-                <w:i w:val="0"/>
-                <w:sz w:val="18"/>
-              </w:rPr>
-              <w:t xml:space="preserve">3. The admissible Govt. subsidy (37.72% of TFO) and the 3% AIF interest subvention reduce the debt burden; average DSCR 3.37 (FA-5).</w:t>
-            </w:r>
-          </w:p>
-          <w:p>
-            <w:pPr>
-              <w:spacing w:before="0" w:after="0" w:line="240" w:lineRule="auto"/>
-            </w:pPr>
-            <w:r>
-              <w:rPr>
-                <w:b w:val="0"/>
-                <w:i w:val="0"/>
-                <w:sz w:val="18"/>
-              </w:rPr>
-              <w:t xml:space="preserve">4. Own bastu land at the project site for the CHC and its new shed.</w:t>
+              <w:t xml:space="preserve">1. A local farmer who knows the farmers and their needs.</w:t>
+            </w:r>
+          </w:p>
+          <w:p>
+            <w:pPr>
+              <w:spacing w:before="0" w:after="0" w:line="240" w:lineRule="auto"/>
+            </w:pPr>
+            <w:r>
+              <w:rPr>
+                <w:b w:val="0"/>
+                <w:i w:val="0"/>
+                <w:sz w:val="18"/>
+              </w:rPr>
+              <w:t xml:space="preserve">2. Combine harvesting is in demand in both paddy seasons.</w:t>
+            </w:r>
+          </w:p>
+          <w:p>
+            <w:pPr>
+              <w:spacing w:before="0" w:after="0" w:line="240" w:lineRule="auto"/>
+            </w:pPr>
+            <w:r>
+              <w:rPr>
+                <w:b w:val="0"/>
+                <w:i w:val="0"/>
+                <w:sz w:val="18"/>
+              </w:rPr>
+              <w:t xml:space="preserve">3. Subsidy (37.72% of TFO) and AIF subvention cut the debt burden; average DSCR 3.37.</w:t>
+            </w:r>
+          </w:p>
+          <w:p>
+            <w:pPr>
+              <w:spacing w:before="0" w:after="0" w:line="240" w:lineRule="auto"/>
+            </w:pPr>
+            <w:r>
+              <w:rPr>
+                <w:b w:val="0"/>
+                <w:i w:val="0"/>
+                <w:sz w:val="18"/>
+              </w:rPr>
+              <w:t xml:space="preserve">4. Own land for the CHC and its shed.</w:t>
             </w:r>
           </w:p>
         </w:tc>
@@ -16236,20 +16215,20 @@
                 <w:i w:val="0"/>
                 <w:sz w:val="18"/>
               </w:rPr>
-              <w:t xml:space="preserve">1. Depends on a hired operator for the combine harvester.</w:t>
-            </w:r>
-          </w:p>
-          <w:p>
-            <w:pPr>
-              <w:spacing w:before="0" w:after="0" w:line="240" w:lineRule="auto"/>
-            </w:pPr>
-            <w:r>
-              <w:rPr>
-                <w:b w:val="0"/>
-                <w:i w:val="0"/>
-                <w:sz w:val="18"/>
-              </w:rPr>
-              <w:t xml:space="preserve">2. Most of the income comes from one machine (the combine harvester) in two short harvest seasons.</w:t>
+              <w:t xml:space="preserve">1. Depends on a hired combine operator.</w:t>
+            </w:r>
+          </w:p>
+          <w:p>
+            <w:pPr>
+              <w:spacing w:before="0" w:after="0" w:line="240" w:lineRule="auto"/>
+            </w:pPr>
+            <w:r>
+              <w:rPr>
+                <w:b w:val="0"/>
+                <w:i w:val="0"/>
+                <w:sz w:val="18"/>
+              </w:rPr>
+              <w:t xml:space="preserve">2. Most income comes from one machine in two short seasons.</w:t>
             </w:r>
           </w:p>
         </w:tc>
@@ -16307,20 +16286,20 @@
                 <w:i w:val="0"/>
                 <w:sz w:val="18"/>
               </w:rPr>
-              <w:t>1. Shortage of farm labour at harvest time.</w:t>
-            </w:r>
-          </w:p>
-          <w:p>
-            <w:pPr>
-              <w:spacing w:before="0" w:after="0" w:line="240" w:lineRule="auto"/>
-            </w:pPr>
-            <w:r>
-              <w:rPr>
-                <w:b w:val="0"/>
-                <w:i w:val="0"/>
-                <w:sz w:val="18"/>
-              </w:rPr>
-              <w:t>2. Two paddy seasons (Aman and Boro) give two harvest windows a year.</w:t>
+              <w:t xml:space="preserve">1. Shortage of farm labour at harvest time.</w:t>
+            </w:r>
+          </w:p>
+          <w:p>
+            <w:pPr>
+              <w:spacing w:before="0" w:after="0" w:line="240" w:lineRule="auto"/>
+            </w:pPr>
+            <w:r>
+              <w:rPr>
+                <w:b w:val="0"/>
+                <w:i w:val="0"/>
+                <w:sz w:val="18"/>
+              </w:rPr>
+              <w:t xml:space="preserve">2. Two paddy seasons a year.</w:t>
             </w:r>
           </w:p>
         </w:tc>
@@ -16378,46 +16357,46 @@
                 <w:i w:val="0"/>
                 <w:sz w:val="18"/>
               </w:rPr>
-              <w:t>1. Rise in diesel price.</w:t>
-            </w:r>
-          </w:p>
-          <w:p>
-            <w:pPr>
-              <w:spacing w:before="0" w:after="0" w:line="240" w:lineRule="auto"/>
-            </w:pPr>
-            <w:r>
-              <w:rPr>
-                <w:b w:val="0"/>
-                <w:i w:val="0"/>
-                <w:sz w:val="18"/>
-              </w:rPr>
-              <w:t>2. Machine breakdown during the harvest season.</w:t>
-            </w:r>
-          </w:p>
-          <w:p>
-            <w:pPr>
-              <w:spacing w:before="0" w:after="0" w:line="240" w:lineRule="auto"/>
-            </w:pPr>
-            <w:r>
-              <w:rPr>
-                <w:b w:val="0"/>
-                <w:i w:val="0"/>
-                <w:sz w:val="18"/>
-              </w:rPr>
-              <w:t>3. Operator not available.</w:t>
-            </w:r>
-          </w:p>
-          <w:p>
-            <w:pPr>
-              <w:spacing w:before="0" w:after="0" w:line="240" w:lineRule="auto"/>
-            </w:pPr>
-            <w:r>
-              <w:rPr>
-                <w:b w:val="0"/>
-                <w:i w:val="0"/>
-                <w:sz w:val="18"/>
-              </w:rPr>
-              <w:t>4. Rain or cyclone shortening the harvest window.</w:t>
+              <w:t xml:space="preserve">1. Rise in diesel price.</w:t>
+            </w:r>
+          </w:p>
+          <w:p>
+            <w:pPr>
+              <w:spacing w:before="0" w:after="0" w:line="240" w:lineRule="auto"/>
+            </w:pPr>
+            <w:r>
+              <w:rPr>
+                <w:b w:val="0"/>
+                <w:i w:val="0"/>
+                <w:sz w:val="18"/>
+              </w:rPr>
+              <w:t xml:space="preserve">2. Breakdown at harvest time.</w:t>
+            </w:r>
+          </w:p>
+          <w:p>
+            <w:pPr>
+              <w:spacing w:before="0" w:after="0" w:line="240" w:lineRule="auto"/>
+            </w:pPr>
+            <w:r>
+              <w:rPr>
+                <w:b w:val="0"/>
+                <w:i w:val="0"/>
+                <w:sz w:val="18"/>
+              </w:rPr>
+              <w:t xml:space="preserve">3. Operator not available.</w:t>
+            </w:r>
+          </w:p>
+          <w:p>
+            <w:pPr>
+              <w:spacing w:before="0" w:after="0" w:line="240" w:lineRule="auto"/>
+            </w:pPr>
+            <w:r>
+              <w:rPr>
+                <w:b w:val="0"/>
+                <w:i w:val="0"/>
+                <w:sz w:val="18"/>
+              </w:rPr>
+              <w:t xml:space="preserve">4. Rain or cyclone at harvest time.</w:t>
             </w:r>
           </w:p>
         </w:tc>
@@ -16580,7 +16559,7 @@
                 <w:i w:val="0"/>
                 <w:sz w:val="18"/>
               </w:rPr>
-              <w:t>Annual review of hire charges with the ADA (Block); fuel-efficient operation and route planning by village cluster.</w:t>
+              <w:t xml:space="preserve">Review hire rates each year with the ADA; plan routes to save fuel.</w:t>
             </w:r>
           </w:p>
         </w:tc>
@@ -16638,7 +16617,7 @@
                 <w:i w:val="0"/>
                 <w:sz w:val="18"/>
               </w:rPr>
-              <w:t xml:space="preserve">AMC with the dealer (Rs 73,900 for 30 months – Rs 41,900 of it paid upfront from TFO – then renewal); 1-year warranty and 4-year after-sales service under the guideline (Cl. VIII(B)(i)); pre-season servicing; stock of fast-moving spares.</w:t>
+              <w:t xml:space="preserve">AMC for 18 months, then renewed; 1-year warranty and 4-year after-sales service (Cl. VIII(B)(i)); servicing before each season; spares in stock.</w:t>
             </w:r>
           </w:p>
         </w:tc>
@@ -16696,7 +16675,7 @@
                 <w:i w:val="0"/>
                 <w:sz w:val="18"/>
               </w:rPr>
-              <w:t xml:space="preserve">Written agreement with an experienced operator before each season; a back-up operator trained from local youth.</w:t>
+              <w:t xml:space="preserve">Written agreement with an operator each season; a trained back-up from local youth.</w:t>
             </w:r>
           </w:p>
         </w:tc>
@@ -16754,7 +16733,7 @@
                 <w:i w:val="0"/>
                 <w:sz w:val="18"/>
               </w:rPr>
-              <w:t xml:space="preserve">Supplier demonstration and training at delivery; guidance from the ADA; simple records (hire register, log book, money receipts).</w:t>
+              <w:t xml:space="preserve">Training by the supplier; guidance from the ADA; simple records.</w:t>
             </w:r>
           </w:p>
         </w:tc>
@@ -16812,7 +16791,7 @@
                 <w:i w:val="0"/>
                 <w:sz w:val="18"/>
               </w:rPr>
-              <w:t xml:space="preserve">Comprehensive insurance (Rs 16,000 a year; first year paid from TFO); parking under the shed; geo-tracking through the telematics kit (Cl. VIII(B)(w)).</w:t>
+              <w:t xml:space="preserve">Insurance (Rs 16,000 a year); parking under the shed; GPS tracking (telematics kit).</w:t>
             </w:r>
           </w:p>
         </w:tc>
@@ -16850,7 +16829,43 @@
           <w:b w:val="0"/>
           <w:i w:val="0"/>
         </w:rPr>
-        <w:t xml:space="preserve">I, Ramprasad Biswas, S/o Sudhir Biswas, of Vill. &amp; P.O. Dakshin Durgapur, G.P. Deulbari Debipur, Block Kultali, Dist. South 24 Parganas, declare that the information given in this project report is true to the best of my knowledge and belief; that my wife and I have not availed any benefit under FSSM/OTA-SFI/FMB/FMH/CHC during 2022-23 to 2025-26; and that I shall set up and run the Custom Hiring Centre as per the Farm Mechanization Scheme 2026-27 guidelines and the agreement with the DDA (Admn) (Annexure-V).</w:t>
+        <w:t xml:space="preserve">I, Ramprasad Biswas, S/o Sudhir Biswas, of Vill. &amp; P.O. Dakshin Durgapur, G.P. Deulbari Debipur, Block Kultali, Dist. South 24 Parganas, declare that:</w:t>
+      </w:r>
+    </w:p>
+    <w:p>
+      <w:pPr>
+        <w:jc w:val="both"/>
+      </w:pPr>
+      <w:r>
+        <w:rPr>
+          <w:b w:val="0"/>
+          <w:i w:val="0"/>
+        </w:rPr>
+        <w:t xml:space="preserve">1. The information in this report is true to the best of my knowledge and belief.</w:t>
+      </w:r>
+    </w:p>
+    <w:p>
+      <w:pPr>
+        <w:jc w:val="both"/>
+      </w:pPr>
+      <w:r>
+        <w:rPr>
+          <w:b w:val="0"/>
+          <w:i w:val="0"/>
+        </w:rPr>
+        <w:t xml:space="preserve">2. My wife and I have taken no benefit under FSSM, OTA-SFI, FMB/FMH or CHC in 2022-23 to 2025-26.</w:t>
+      </w:r>
+    </w:p>
+    <w:p>
+      <w:pPr>
+        <w:jc w:val="both"/>
+      </w:pPr>
+      <w:r>
+        <w:rPr>
+          <w:b w:val="0"/>
+          <w:i w:val="0"/>
+        </w:rPr>
+        <w:t xml:space="preserve">3. I will set up and run the CHC as per the FMS 2026-27 guidelines and my agreement with the DDA (Admn) (Annexure-V).</w:t>
       </w:r>
     </w:p>
     <w:p>
@@ -21071,199 +21086,199 @@
                 <w:sz w:val="18"/>
                 <w:szCs w:val="18"/>
               </w:rPr>
-              <w:t>Repairs and spares (as per IS 9164)</w:t>
-            </w:r>
-          </w:p>
-        </w:tc>
-        <w:tc>
-          <w:tcPr>
-            <w:tcW w:w="1417" w:type="dxa"/>
-          </w:tcPr>
-          <w:p>
-            <w:pPr>
-              <w:spacing w:before="0" w:after="0" w:line="240" w:lineRule="auto"/>
-              <w:jc w:val="right"/>
-              <w:rPr>
-                <w:sz w:val="18"/>
-                <w:szCs w:val="18"/>
-              </w:rPr>
-            </w:pPr>
-            <w:r>
-              <w:rPr>
-                <w:b w:val="0"/>
-                <w:i w:val="0"/>
-                <w:sz w:val="18"/>
-                <w:szCs w:val="18"/>
-              </w:rPr>
-              <w:t>54,295</w:t>
-            </w:r>
-          </w:p>
-        </w:tc>
-        <w:tc>
-          <w:tcPr>
-            <w:tcW w:w="1417" w:type="dxa"/>
-          </w:tcPr>
-          <w:p>
-            <w:pPr>
-              <w:spacing w:before="0" w:after="0" w:line="240" w:lineRule="auto"/>
-              <w:jc w:val="right"/>
-              <w:rPr>
-                <w:sz w:val="18"/>
-                <w:szCs w:val="18"/>
-              </w:rPr>
-            </w:pPr>
-            <w:r>
-              <w:rPr>
-                <w:b w:val="0"/>
-                <w:i w:val="0"/>
-                <w:sz w:val="18"/>
-                <w:szCs w:val="18"/>
-              </w:rPr>
-              <w:t>1,34,151</w:t>
-            </w:r>
-          </w:p>
-        </w:tc>
-        <w:tc>
-          <w:tcPr>
-            <w:tcW w:w="1417" w:type="dxa"/>
-          </w:tcPr>
-          <w:p>
-            <w:pPr>
-              <w:spacing w:before="0" w:after="0" w:line="240" w:lineRule="auto"/>
-              <w:jc w:val="right"/>
-              <w:rPr>
-                <w:sz w:val="18"/>
-                <w:szCs w:val="18"/>
-              </w:rPr>
-            </w:pPr>
-            <w:r>
-              <w:rPr>
-                <w:b w:val="0"/>
-                <w:i w:val="0"/>
-                <w:sz w:val="18"/>
-                <w:szCs w:val="18"/>
-              </w:rPr>
-              <w:t>1,86,099</w:t>
-            </w:r>
-          </w:p>
-        </w:tc>
-        <w:tc>
-          <w:tcPr>
-            <w:tcW w:w="1417" w:type="dxa"/>
-          </w:tcPr>
-          <w:p>
-            <w:pPr>
-              <w:spacing w:before="0" w:after="0" w:line="240" w:lineRule="auto"/>
-              <w:jc w:val="right"/>
-              <w:rPr>
-                <w:sz w:val="18"/>
-                <w:szCs w:val="18"/>
-              </w:rPr>
-            </w:pPr>
-            <w:r>
-              <w:rPr>
-                <w:b w:val="0"/>
-                <w:i w:val="0"/>
-                <w:sz w:val="18"/>
-                <w:szCs w:val="18"/>
-              </w:rPr>
-              <w:t>2,34,593</w:t>
-            </w:r>
-          </w:p>
-        </w:tc>
-        <w:tc>
-          <w:tcPr>
-            <w:tcW w:w="1417" w:type="dxa"/>
-          </w:tcPr>
-          <w:p>
-            <w:pPr>
-              <w:spacing w:before="0" w:after="0" w:line="240" w:lineRule="auto"/>
-              <w:jc w:val="right"/>
-              <w:rPr>
-                <w:sz w:val="18"/>
-                <w:szCs w:val="18"/>
-              </w:rPr>
-            </w:pPr>
-            <w:r>
-              <w:rPr>
-                <w:b w:val="0"/>
-                <w:i w:val="0"/>
-                <w:sz w:val="18"/>
-                <w:szCs w:val="18"/>
-              </w:rPr>
-              <w:t>2,65,610</w:t>
-            </w:r>
-          </w:p>
-        </w:tc>
-        <w:tc>
-          <w:tcPr>
-            <w:tcW w:w="1417" w:type="dxa"/>
-          </w:tcPr>
-          <w:p>
-            <w:pPr>
-              <w:spacing w:before="0" w:after="0" w:line="240" w:lineRule="auto"/>
-              <w:jc w:val="right"/>
-              <w:rPr>
-                <w:sz w:val="18"/>
-                <w:szCs w:val="18"/>
-              </w:rPr>
-            </w:pPr>
-            <w:r>
-              <w:rPr>
-                <w:b w:val="0"/>
-                <w:i w:val="0"/>
-                <w:sz w:val="18"/>
-                <w:szCs w:val="18"/>
-              </w:rPr>
-              <w:t>2,91,903</w:t>
-            </w:r>
-          </w:p>
-        </w:tc>
-        <w:tc>
-          <w:tcPr>
-            <w:tcW w:w="1417" w:type="dxa"/>
-          </w:tcPr>
-          <w:p>
-            <w:pPr>
-              <w:spacing w:before="0" w:after="0" w:line="240" w:lineRule="auto"/>
-              <w:jc w:val="right"/>
-              <w:rPr>
-                <w:sz w:val="18"/>
-                <w:szCs w:val="18"/>
-              </w:rPr>
-            </w:pPr>
-            <w:r>
-              <w:rPr>
-                <w:b w:val="0"/>
-                <w:i w:val="0"/>
-                <w:sz w:val="18"/>
-                <w:szCs w:val="18"/>
-              </w:rPr>
-              <w:t>3,14,876</w:t>
-            </w:r>
-          </w:p>
-        </w:tc>
-        <w:tc>
-          <w:tcPr>
-            <w:tcW w:w="1417" w:type="dxa"/>
-          </w:tcPr>
-          <w:p>
-            <w:pPr>
-              <w:spacing w:before="0" w:after="0" w:line="240" w:lineRule="auto"/>
-              <w:jc w:val="right"/>
-              <w:rPr>
-                <w:sz w:val="18"/>
-                <w:szCs w:val="18"/>
-              </w:rPr>
-            </w:pPr>
-            <w:r>
-              <w:rPr>
-                <w:b w:val="0"/>
-                <w:i w:val="0"/>
-                <w:sz w:val="18"/>
-                <w:szCs w:val="18"/>
-              </w:rPr>
-              <w:t>14,81,527</w:t>
+              <w:t xml:space="preserve">Repairs and spares (IS 9164, less AMC)</w:t>
+            </w:r>
+          </w:p>
+        </w:tc>
+        <w:tc>
+          <w:tcPr>
+            <w:tcW w:w="1417" w:type="dxa"/>
+          </w:tcPr>
+          <w:p>
+            <w:pPr>
+              <w:spacing w:before="0" w:after="0" w:line="240" w:lineRule="auto"/>
+              <w:jc w:val="right"/>
+              <w:rPr>
+                <w:sz w:val="18"/>
+                <w:szCs w:val="18"/>
+              </w:rPr>
+            </w:pPr>
+            <w:r>
+              <w:rPr>
+                <w:b w:val="0"/>
+                <w:i w:val="0"/>
+                <w:sz w:val="18"/>
+                <w:szCs w:val="18"/>
+              </w:rPr>
+              <w:t xml:space="preserve">55,922</w:t>
+            </w:r>
+          </w:p>
+        </w:tc>
+        <w:tc>
+          <w:tcPr>
+            <w:tcW w:w="1417" w:type="dxa"/>
+          </w:tcPr>
+          <w:p>
+            <w:pPr>
+              <w:spacing w:before="0" w:after="0" w:line="240" w:lineRule="auto"/>
+              <w:jc w:val="right"/>
+              <w:rPr>
+                <w:sz w:val="18"/>
+                <w:szCs w:val="18"/>
+              </w:rPr>
+            </w:pPr>
+            <w:r>
+              <w:rPr>
+                <w:b w:val="0"/>
+                <w:i w:val="0"/>
+                <w:sz w:val="18"/>
+                <w:szCs w:val="18"/>
+              </w:rPr>
+              <w:t xml:space="preserve">1,29,744</w:t>
+            </w:r>
+          </w:p>
+        </w:tc>
+        <w:tc>
+          <w:tcPr>
+            <w:tcW w:w="1417" w:type="dxa"/>
+          </w:tcPr>
+          <w:p>
+            <w:pPr>
+              <w:spacing w:before="0" w:after="0" w:line="240" w:lineRule="auto"/>
+              <w:jc w:val="right"/>
+              <w:rPr>
+                <w:sz w:val="18"/>
+                <w:szCs w:val="18"/>
+              </w:rPr>
+            </w:pPr>
+            <w:r>
+              <w:rPr>
+                <w:b w:val="0"/>
+                <w:i w:val="0"/>
+                <w:sz w:val="18"/>
+                <w:szCs w:val="18"/>
+              </w:rPr>
+              <w:t xml:space="preserve">1,80,879</w:t>
+            </w:r>
+          </w:p>
+        </w:tc>
+        <w:tc>
+          <w:tcPr>
+            <w:tcW w:w="1417" w:type="dxa"/>
+          </w:tcPr>
+          <w:p>
+            <w:pPr>
+              <w:spacing w:before="0" w:after="0" w:line="240" w:lineRule="auto"/>
+              <w:jc w:val="right"/>
+              <w:rPr>
+                <w:sz w:val="18"/>
+                <w:szCs w:val="18"/>
+              </w:rPr>
+            </w:pPr>
+            <w:r>
+              <w:rPr>
+                <w:b w:val="0"/>
+                <w:i w:val="0"/>
+                <w:sz w:val="18"/>
+                <w:szCs w:val="18"/>
+              </w:rPr>
+              <w:t xml:space="preserve">2,34,593</w:t>
+            </w:r>
+          </w:p>
+        </w:tc>
+        <w:tc>
+          <w:tcPr>
+            <w:tcW w:w="1417" w:type="dxa"/>
+          </w:tcPr>
+          <w:p>
+            <w:pPr>
+              <w:spacing w:before="0" w:after="0" w:line="240" w:lineRule="auto"/>
+              <w:jc w:val="right"/>
+              <w:rPr>
+                <w:sz w:val="18"/>
+                <w:szCs w:val="18"/>
+              </w:rPr>
+            </w:pPr>
+            <w:r>
+              <w:rPr>
+                <w:b w:val="0"/>
+                <w:i w:val="0"/>
+                <w:sz w:val="18"/>
+                <w:szCs w:val="18"/>
+              </w:rPr>
+              <w:t xml:space="preserve">2,65,610</w:t>
+            </w:r>
+          </w:p>
+        </w:tc>
+        <w:tc>
+          <w:tcPr>
+            <w:tcW w:w="1417" w:type="dxa"/>
+          </w:tcPr>
+          <w:p>
+            <w:pPr>
+              <w:spacing w:before="0" w:after="0" w:line="240" w:lineRule="auto"/>
+              <w:jc w:val="right"/>
+              <w:rPr>
+                <w:sz w:val="18"/>
+                <w:szCs w:val="18"/>
+              </w:rPr>
+            </w:pPr>
+            <w:r>
+              <w:rPr>
+                <w:b w:val="0"/>
+                <w:i w:val="0"/>
+                <w:sz w:val="18"/>
+                <w:szCs w:val="18"/>
+              </w:rPr>
+              <w:t xml:space="preserve">2,91,903</w:t>
+            </w:r>
+          </w:p>
+        </w:tc>
+        <w:tc>
+          <w:tcPr>
+            <w:tcW w:w="1417" w:type="dxa"/>
+          </w:tcPr>
+          <w:p>
+            <w:pPr>
+              <w:spacing w:before="0" w:after="0" w:line="240" w:lineRule="auto"/>
+              <w:jc w:val="right"/>
+              <w:rPr>
+                <w:sz w:val="18"/>
+                <w:szCs w:val="18"/>
+              </w:rPr>
+            </w:pPr>
+            <w:r>
+              <w:rPr>
+                <w:b w:val="0"/>
+                <w:i w:val="0"/>
+                <w:sz w:val="18"/>
+                <w:szCs w:val="18"/>
+              </w:rPr>
+              <w:t xml:space="preserve">3,14,876</w:t>
+            </w:r>
+          </w:p>
+        </w:tc>
+        <w:tc>
+          <w:tcPr>
+            <w:tcW w:w="1417" w:type="dxa"/>
+          </w:tcPr>
+          <w:p>
+            <w:pPr>
+              <w:spacing w:before="0" w:after="0" w:line="240" w:lineRule="auto"/>
+              <w:jc w:val="right"/>
+              <w:rPr>
+                <w:sz w:val="18"/>
+                <w:szCs w:val="18"/>
+              </w:rPr>
+            </w:pPr>
+            <w:r>
+              <w:rPr>
+                <w:b w:val="0"/>
+                <w:i w:val="0"/>
+                <w:sz w:val="18"/>
+                <w:szCs w:val="18"/>
+              </w:rPr>
+              <w:t xml:space="preserve">14,73,527</w:t>
             </w:r>
           </w:p>
         </w:tc>
@@ -21308,199 +21323,199 @@
                 <w:sz w:val="18"/>
                 <w:szCs w:val="18"/>
               </w:rPr>
-              <w:t>AMC (Rs 73,900 for 30 months, then renewal; Rs 41,900 paid from TFO)</w:t>
-            </w:r>
-          </w:p>
-        </w:tc>
-        <w:tc>
-          <w:tcPr>
-            <w:tcW w:w="1417" w:type="dxa"/>
-          </w:tcPr>
-          <w:p>
-            <w:pPr>
-              <w:spacing w:before="0" w:after="0" w:line="240" w:lineRule="auto"/>
-              <w:jc w:val="right"/>
-              <w:rPr>
-                <w:sz w:val="18"/>
-                <w:szCs w:val="18"/>
-              </w:rPr>
-            </w:pPr>
-            <w:r>
-              <w:rPr>
-                <w:b w:val="0"/>
-                <w:i w:val="0"/>
-                <w:sz w:val="18"/>
-                <w:szCs w:val="18"/>
-              </w:rPr>
-              <w:t>29,560</w:t>
-            </w:r>
-          </w:p>
-        </w:tc>
-        <w:tc>
-          <w:tcPr>
-            <w:tcW w:w="1417" w:type="dxa"/>
-          </w:tcPr>
-          <w:p>
-            <w:pPr>
-              <w:spacing w:before="0" w:after="0" w:line="240" w:lineRule="auto"/>
-              <w:jc w:val="right"/>
-              <w:rPr>
-                <w:sz w:val="18"/>
-                <w:szCs w:val="18"/>
-              </w:rPr>
-            </w:pPr>
-            <w:r>
-              <w:rPr>
-                <w:b w:val="0"/>
-                <w:i w:val="0"/>
-                <w:sz w:val="18"/>
-                <w:szCs w:val="18"/>
-              </w:rPr>
-              <w:t>29,560</w:t>
-            </w:r>
-          </w:p>
-        </w:tc>
-        <w:tc>
-          <w:tcPr>
-            <w:tcW w:w="1417" w:type="dxa"/>
-          </w:tcPr>
-          <w:p>
-            <w:pPr>
-              <w:spacing w:before="0" w:after="0" w:line="240" w:lineRule="auto"/>
-              <w:jc w:val="right"/>
-              <w:rPr>
-                <w:sz w:val="18"/>
-                <w:szCs w:val="18"/>
-              </w:rPr>
-            </w:pPr>
-            <w:r>
-              <w:rPr>
-                <w:b w:val="0"/>
-                <w:i w:val="0"/>
-                <w:sz w:val="18"/>
-                <w:szCs w:val="18"/>
-              </w:rPr>
-              <w:t>34,780</w:t>
-            </w:r>
-          </w:p>
-        </w:tc>
-        <w:tc>
-          <w:tcPr>
-            <w:tcW w:w="1417" w:type="dxa"/>
-          </w:tcPr>
-          <w:p>
-            <w:pPr>
-              <w:spacing w:before="0" w:after="0" w:line="240" w:lineRule="auto"/>
-              <w:jc w:val="right"/>
-              <w:rPr>
-                <w:sz w:val="18"/>
-                <w:szCs w:val="18"/>
-              </w:rPr>
-            </w:pPr>
-            <w:r>
-              <w:rPr>
-                <w:b w:val="0"/>
-                <w:i w:val="0"/>
-                <w:sz w:val="18"/>
-                <w:szCs w:val="18"/>
-              </w:rPr>
-              <w:t>40,000</w:t>
-            </w:r>
-          </w:p>
-        </w:tc>
-        <w:tc>
-          <w:tcPr>
-            <w:tcW w:w="1417" w:type="dxa"/>
-          </w:tcPr>
-          <w:p>
-            <w:pPr>
-              <w:spacing w:before="0" w:after="0" w:line="240" w:lineRule="auto"/>
-              <w:jc w:val="right"/>
-              <w:rPr>
-                <w:sz w:val="18"/>
-                <w:szCs w:val="18"/>
-              </w:rPr>
-            </w:pPr>
-            <w:r>
-              <w:rPr>
-                <w:b w:val="0"/>
-                <w:i w:val="0"/>
-                <w:sz w:val="18"/>
-                <w:szCs w:val="18"/>
-              </w:rPr>
-              <w:t>42,000</w:t>
-            </w:r>
-          </w:p>
-        </w:tc>
-        <w:tc>
-          <w:tcPr>
-            <w:tcW w:w="1417" w:type="dxa"/>
-          </w:tcPr>
-          <w:p>
-            <w:pPr>
-              <w:spacing w:before="0" w:after="0" w:line="240" w:lineRule="auto"/>
-              <w:jc w:val="right"/>
-              <w:rPr>
-                <w:sz w:val="18"/>
-                <w:szCs w:val="18"/>
-              </w:rPr>
-            </w:pPr>
-            <w:r>
-              <w:rPr>
-                <w:b w:val="0"/>
-                <w:i w:val="0"/>
-                <w:sz w:val="18"/>
-                <w:szCs w:val="18"/>
-              </w:rPr>
-              <w:t>44,100</w:t>
-            </w:r>
-          </w:p>
-        </w:tc>
-        <w:tc>
-          <w:tcPr>
-            <w:tcW w:w="1417" w:type="dxa"/>
-          </w:tcPr>
-          <w:p>
-            <w:pPr>
-              <w:spacing w:before="0" w:after="0" w:line="240" w:lineRule="auto"/>
-              <w:jc w:val="right"/>
-              <w:rPr>
-                <w:sz w:val="18"/>
-                <w:szCs w:val="18"/>
-              </w:rPr>
-            </w:pPr>
-            <w:r>
-              <w:rPr>
-                <w:b w:val="0"/>
-                <w:i w:val="0"/>
-                <w:sz w:val="18"/>
-                <w:szCs w:val="18"/>
-              </w:rPr>
-              <w:t>46,305</w:t>
-            </w:r>
-          </w:p>
-        </w:tc>
-        <w:tc>
-          <w:tcPr>
-            <w:tcW w:w="1417" w:type="dxa"/>
-          </w:tcPr>
-          <w:p>
-            <w:pPr>
-              <w:spacing w:before="0" w:after="0" w:line="240" w:lineRule="auto"/>
-              <w:jc w:val="right"/>
-              <w:rPr>
-                <w:sz w:val="18"/>
-                <w:szCs w:val="18"/>
-              </w:rPr>
-            </w:pPr>
-            <w:r>
-              <w:rPr>
-                <w:b w:val="0"/>
-                <w:i w:val="0"/>
-                <w:sz w:val="18"/>
-                <w:szCs w:val="18"/>
-              </w:rPr>
-              <w:t>2,66,305</w:t>
+              <w:t xml:space="preserve">AMC (Rs 41,900 for 18 months from TFO, then renewal)</w:t>
+            </w:r>
+          </w:p>
+        </w:tc>
+        <w:tc>
+          <w:tcPr>
+            <w:tcW w:w="1417" w:type="dxa"/>
+          </w:tcPr>
+          <w:p>
+            <w:pPr>
+              <w:spacing w:before="0" w:after="0" w:line="240" w:lineRule="auto"/>
+              <w:jc w:val="right"/>
+              <w:rPr>
+                <w:sz w:val="18"/>
+                <w:szCs w:val="18"/>
+              </w:rPr>
+            </w:pPr>
+            <w:r>
+              <w:rPr>
+                <w:b w:val="0"/>
+                <w:i w:val="0"/>
+                <w:sz w:val="18"/>
+                <w:szCs w:val="18"/>
+              </w:rPr>
+              <w:t xml:space="preserve">27,933</w:t>
+            </w:r>
+          </w:p>
+        </w:tc>
+        <w:tc>
+          <w:tcPr>
+            <w:tcW w:w="1417" w:type="dxa"/>
+          </w:tcPr>
+          <w:p>
+            <w:pPr>
+              <w:spacing w:before="0" w:after="0" w:line="240" w:lineRule="auto"/>
+              <w:jc w:val="right"/>
+              <w:rPr>
+                <w:sz w:val="18"/>
+                <w:szCs w:val="18"/>
+              </w:rPr>
+            </w:pPr>
+            <w:r>
+              <w:rPr>
+                <w:b w:val="0"/>
+                <w:i w:val="0"/>
+                <w:sz w:val="18"/>
+                <w:szCs w:val="18"/>
+              </w:rPr>
+              <w:t xml:space="preserve">33,967</w:t>
+            </w:r>
+          </w:p>
+        </w:tc>
+        <w:tc>
+          <w:tcPr>
+            <w:tcW w:w="1417" w:type="dxa"/>
+          </w:tcPr>
+          <w:p>
+            <w:pPr>
+              <w:spacing w:before="0" w:after="0" w:line="240" w:lineRule="auto"/>
+              <w:jc w:val="right"/>
+              <w:rPr>
+                <w:sz w:val="18"/>
+                <w:szCs w:val="18"/>
+              </w:rPr>
+            </w:pPr>
+            <w:r>
+              <w:rPr>
+                <w:b w:val="0"/>
+                <w:i w:val="0"/>
+                <w:sz w:val="18"/>
+                <w:szCs w:val="18"/>
+              </w:rPr>
+              <w:t xml:space="preserve">40,000</w:t>
+            </w:r>
+          </w:p>
+        </w:tc>
+        <w:tc>
+          <w:tcPr>
+            <w:tcW w:w="1417" w:type="dxa"/>
+          </w:tcPr>
+          <w:p>
+            <w:pPr>
+              <w:spacing w:before="0" w:after="0" w:line="240" w:lineRule="auto"/>
+              <w:jc w:val="right"/>
+              <w:rPr>
+                <w:sz w:val="18"/>
+                <w:szCs w:val="18"/>
+              </w:rPr>
+            </w:pPr>
+            <w:r>
+              <w:rPr>
+                <w:b w:val="0"/>
+                <w:i w:val="0"/>
+                <w:sz w:val="18"/>
+                <w:szCs w:val="18"/>
+              </w:rPr>
+              <w:t xml:space="preserve">40,000</w:t>
+            </w:r>
+          </w:p>
+        </w:tc>
+        <w:tc>
+          <w:tcPr>
+            <w:tcW w:w="1417" w:type="dxa"/>
+          </w:tcPr>
+          <w:p>
+            <w:pPr>
+              <w:spacing w:before="0" w:after="0" w:line="240" w:lineRule="auto"/>
+              <w:jc w:val="right"/>
+              <w:rPr>
+                <w:sz w:val="18"/>
+                <w:szCs w:val="18"/>
+              </w:rPr>
+            </w:pPr>
+            <w:r>
+              <w:rPr>
+                <w:b w:val="0"/>
+                <w:i w:val="0"/>
+                <w:sz w:val="18"/>
+                <w:szCs w:val="18"/>
+              </w:rPr>
+              <w:t xml:space="preserve">42,000</w:t>
+            </w:r>
+          </w:p>
+        </w:tc>
+        <w:tc>
+          <w:tcPr>
+            <w:tcW w:w="1417" w:type="dxa"/>
+          </w:tcPr>
+          <w:p>
+            <w:pPr>
+              <w:spacing w:before="0" w:after="0" w:line="240" w:lineRule="auto"/>
+              <w:jc w:val="right"/>
+              <w:rPr>
+                <w:sz w:val="18"/>
+                <w:szCs w:val="18"/>
+              </w:rPr>
+            </w:pPr>
+            <w:r>
+              <w:rPr>
+                <w:b w:val="0"/>
+                <w:i w:val="0"/>
+                <w:sz w:val="18"/>
+                <w:szCs w:val="18"/>
+              </w:rPr>
+              <w:t xml:space="preserve">44,100</w:t>
+            </w:r>
+          </w:p>
+        </w:tc>
+        <w:tc>
+          <w:tcPr>
+            <w:tcW w:w="1417" w:type="dxa"/>
+          </w:tcPr>
+          <w:p>
+            <w:pPr>
+              <w:spacing w:before="0" w:after="0" w:line="240" w:lineRule="auto"/>
+              <w:jc w:val="right"/>
+              <w:rPr>
+                <w:sz w:val="18"/>
+                <w:szCs w:val="18"/>
+              </w:rPr>
+            </w:pPr>
+            <w:r>
+              <w:rPr>
+                <w:b w:val="0"/>
+                <w:i w:val="0"/>
+                <w:sz w:val="18"/>
+                <w:szCs w:val="18"/>
+              </w:rPr>
+              <w:t xml:space="preserve">46,305</w:t>
+            </w:r>
+          </w:p>
+        </w:tc>
+        <w:tc>
+          <w:tcPr>
+            <w:tcW w:w="1417" w:type="dxa"/>
+          </w:tcPr>
+          <w:p>
+            <w:pPr>
+              <w:spacing w:before="0" w:after="0" w:line="240" w:lineRule="auto"/>
+              <w:jc w:val="right"/>
+              <w:rPr>
+                <w:sz w:val="18"/>
+                <w:szCs w:val="18"/>
+              </w:rPr>
+            </w:pPr>
+            <w:r>
+              <w:rPr>
+                <w:b w:val="0"/>
+                <w:i w:val="0"/>
+                <w:sz w:val="18"/>
+                <w:szCs w:val="18"/>
+              </w:rPr>
+              <w:t xml:space="preserve">2,74,305</w:t>
             </w:r>
           </w:p>
         </w:tc>
@@ -25599,45 +25614,45 @@
                 <w:i w:val="0"/>
                 <w:sz w:val="16"/>
               </w:rPr>
-              <w:t xml:space="preserve">Add: AMC and insurance paid from TFO – 40% met by subsidy, not allowed for tax</w:t>
-            </w:r>
-          </w:p>
-        </w:tc>
-        <w:tc>
-          <w:tcPr>
-            <w:tcW w:w="1417" w:type="dxa"/>
-          </w:tcPr>
-          <w:p>
-            <w:pPr>
-              <w:spacing w:before="0" w:after="0" w:line="240" w:lineRule="auto"/>
-              <w:jc w:val="right"/>
-            </w:pPr>
-            <w:r>
-              <w:rPr>
-                <w:b w:val="0"/>
-                <w:i w:val="0"/>
-                <w:sz w:val="16"/>
-              </w:rPr>
-              <w:t xml:space="preserve">18,224</w:t>
-            </w:r>
-          </w:p>
-        </w:tc>
-        <w:tc>
-          <w:tcPr>
-            <w:tcW w:w="1417" w:type="dxa"/>
-          </w:tcPr>
-          <w:p>
-            <w:pPr>
-              <w:spacing w:before="0" w:after="0" w:line="240" w:lineRule="auto"/>
-              <w:jc w:val="right"/>
-            </w:pPr>
-            <w:r>
-              <w:rPr>
-                <w:b w:val="0"/>
-                <w:i w:val="0"/>
-                <w:sz w:val="16"/>
-              </w:rPr>
-              <w:t xml:space="preserve">4,936</w:t>
+              <w:t xml:space="preserve">Add: AMC and insurance from TFO met by subsidy (40%)</w:t>
+            </w:r>
+          </w:p>
+        </w:tc>
+        <w:tc>
+          <w:tcPr>
+            <w:tcW w:w="1417" w:type="dxa"/>
+          </w:tcPr>
+          <w:p>
+            <w:pPr>
+              <w:spacing w:before="0" w:after="0" w:line="240" w:lineRule="auto"/>
+              <w:jc w:val="right"/>
+            </w:pPr>
+            <w:r>
+              <w:rPr>
+                <w:b w:val="0"/>
+                <w:i w:val="0"/>
+                <w:sz w:val="16"/>
+              </w:rPr>
+              <w:t xml:space="preserve">17,573</w:t>
+            </w:r>
+          </w:p>
+        </w:tc>
+        <w:tc>
+          <w:tcPr>
+            <w:tcW w:w="1417" w:type="dxa"/>
+          </w:tcPr>
+          <w:p>
+            <w:pPr>
+              <w:spacing w:before="0" w:after="0" w:line="240" w:lineRule="auto"/>
+              <w:jc w:val="right"/>
+            </w:pPr>
+            <w:r>
+              <w:rPr>
+                <w:b w:val="0"/>
+                <w:i w:val="0"/>
+                <w:sz w:val="16"/>
+              </w:rPr>
+              <w:t xml:space="preserve">5,587</w:t>
             </w:r>
           </w:p>
         </w:tc>
@@ -26196,7 +26211,7 @@
                 <w:i w:val="0"/>
                 <w:sz w:val="16"/>
               </w:rPr>
-              <w:t xml:space="preserve">3,27,093</w:t>
+              <w:t xml:space="preserve">3,26,442</w:t>
             </w:r>
           </w:p>
         </w:tc>
@@ -26216,7 +26231,7 @@
                 <w:i w:val="0"/>
                 <w:sz w:val="16"/>
               </w:rPr>
-              <w:t xml:space="preserve">4,35,796</w:t>
+              <w:t xml:space="preserve">4,36,447</w:t>
             </w:r>
           </w:p>
         </w:tc>
@@ -26414,7 +26429,7 @@
                 <w:i w:val="0"/>
                 <w:sz w:val="16"/>
               </w:rPr>
-              <w:t xml:space="preserve">1,790</w:t>
+              <w:t xml:space="preserve">1,822</w:t>
             </w:r>
           </w:p>
         </w:tc>
@@ -26528,7 +26543,7 @@
                 <w:i w:val="0"/>
                 <w:sz w:val="16"/>
               </w:rPr>
-              <w:t xml:space="preserve">55,625</w:t>
+              <w:t xml:space="preserve">55,657</w:t>
             </w:r>
           </w:p>
         </w:tc>
@@ -26606,7 +26621,7 @@
                 <w:i w:val="0"/>
                 <w:sz w:val="16"/>
               </w:rPr>
-              <w:t xml:space="preserve">1,790</w:t>
+              <w:t xml:space="preserve">1,822</w:t>
             </w:r>
           </w:p>
         </w:tc>
@@ -26720,7 +26735,7 @@
                 <w:i w:val="0"/>
                 <w:sz w:val="16"/>
               </w:rPr>
-              <w:t xml:space="preserve">55,625</w:t>
+              <w:t xml:space="preserve">55,657</w:t>
             </w:r>
           </w:p>
         </w:tc>
@@ -26937,7 +26952,7 @@
           <w:i/>
           <w:sz w:val="17"/>
         </w:rPr>
-        <w:t xml:space="preserve">Opening value = cost in Year I, then the previous year-end value. Book depreciation is on the full cost of the machinery and the shed; the subsidy is shown as a capital grant in the balance sheet (FA-8). For tax, depreciation is on cost net of subsidy, and the AMC and insurance paid from the TFO are allowed only for the 60% not met by the subsidy. Hire income of the CHC is business income, not agricultural income. For projection, the applicant is taken as a resident individual under the new tax regime (s. 202, Income-tax Act, 2025: nil up to Rs 4 lakh, 5% on Rs 4–8 lakh, 10% on Rs 8–12 lakh) with no other taxable income; as his total income stays below Rs 12 lakh in every year, the rebate under s. 156 (up to Rs 60,000) makes the tax nil. The actual tax will depend on his total income and the Income-tax law in force.</w:t>
+        <w:t xml:space="preserve">Book depreciation is on full cost; tax depreciation is on cost less subsidy. Hire income is business income. Tax uses the new regime (s. 202, Income-tax Act, 2025) and assumes no other income. Income stays below Rs 12 lakh, so the s. 156 rebate makes the tax nil. Actual tax depends on his total income.</w:t>
       </w:r>
     </w:p>
     <w:p>
@@ -26959,7 +26974,7 @@
           <w:sz w:val="23"/>
           <w:szCs w:val="23"/>
         </w:rPr>
-        <w:t xml:space="preserve">FA-4 Repayment of the loan with interest, with AIF interest subvention (Rs)</w:t>
+        <w:t xml:space="preserve">FA-4 Repayment of the loan with interest (Rs)</w:t>
       </w:r>
     </w:p>
     <w:tbl>
@@ -28527,7 +28542,7 @@
           <w:i/>
           <w:sz w:val="17"/>
         </w:rPr>
-        <w:t xml:space="preserve">Interest assumed at 9% p.a. (the AIF lending-rate cap; the actual rate is set by the bank, Cl. XIII(6)(c)) on the reducing balance. The loan with interest (Rs 11,02,452) is repaid in 10 half-yearly instalments in Years II–VI (Rs 1,10,245 each, the last Rs 1,10,247) – one grace year, then repayment over 5 years and not earlier (Cl. XI(j)(ii), (vi); Annexure-V, item x). The 3% AIF subvention is claimed by the bank and passed on to the applicant, so he bears 6% p.a. – the figure used in Section 10.3 and FA-3. No interest is charged on the loan without interest (Rs 11,15,636), which is adjusted from the Subsidy Reserve Fund after the loan with interest is repaid (Cl. XIII(3), (5)).</w:t>
+        <w:t xml:space="preserve">Interest assumed at 9% p.a. on the reducing balance; he pays 6% after the 3% AIF subvention. One grace year, then 10 half-yearly instalments of Rs 1,10,245 (last Rs 1,10,247); no early repayment (Cl. XI(j)). The loan without interest is set off from the Subsidy Reserve Fund after this loan is repaid.</w:t>
       </w:r>
     </w:p>
     <w:p>
@@ -29056,7 +29071,7 @@
                 <w:i w:val="0"/>
                 <w:sz w:val="16"/>
               </w:rPr>
-              <w:t xml:space="preserve">Add: depreciation (non-cash)</w:t>
+              <w:t xml:space="preserve">Add: depreciation</w:t>
             </w:r>
           </w:p>
         </w:tc>
@@ -29229,7 +29244,7 @@
                 <w:i w:val="0"/>
                 <w:sz w:val="16"/>
               </w:rPr>
-              <w:t xml:space="preserve">Add: net interest on the bank loan</w:t>
+              <w:t xml:space="preserve">Add: net interest</w:t>
             </w:r>
           </w:p>
         </w:tc>
@@ -29402,45 +29417,45 @@
                 <w:i w:val="0"/>
                 <w:sz w:val="16"/>
               </w:rPr>
-              <w:t xml:space="preserve">Add: AMC and insurance paid from TFO (non-cash)</w:t>
-            </w:r>
-          </w:p>
-        </w:tc>
-        <w:tc>
-          <w:tcPr>
-            <w:tcW w:w="1417" w:type="dxa"/>
-          </w:tcPr>
-          <w:p>
-            <w:pPr>
-              <w:spacing w:before="0" w:after="0" w:line="240" w:lineRule="auto"/>
-              <w:jc w:val="right"/>
-            </w:pPr>
-            <w:r>
-              <w:rPr>
-                <w:b w:val="0"/>
-                <w:i w:val="0"/>
-                <w:sz w:val="16"/>
-              </w:rPr>
-              <w:t xml:space="preserve">45,560</w:t>
-            </w:r>
-          </w:p>
-        </w:tc>
-        <w:tc>
-          <w:tcPr>
-            <w:tcW w:w="1417" w:type="dxa"/>
-          </w:tcPr>
-          <w:p>
-            <w:pPr>
-              <w:spacing w:before="0" w:after="0" w:line="240" w:lineRule="auto"/>
-              <w:jc w:val="right"/>
-            </w:pPr>
-            <w:r>
-              <w:rPr>
-                <w:b w:val="0"/>
-                <w:i w:val="0"/>
-                <w:sz w:val="16"/>
-              </w:rPr>
-              <w:t xml:space="preserve">12,340</w:t>
+              <w:t xml:space="preserve">Add: AMC and insurance from TFO</w:t>
+            </w:r>
+          </w:p>
+        </w:tc>
+        <w:tc>
+          <w:tcPr>
+            <w:tcW w:w="1417" w:type="dxa"/>
+          </w:tcPr>
+          <w:p>
+            <w:pPr>
+              <w:spacing w:before="0" w:after="0" w:line="240" w:lineRule="auto"/>
+              <w:jc w:val="right"/>
+            </w:pPr>
+            <w:r>
+              <w:rPr>
+                <w:b w:val="0"/>
+                <w:i w:val="0"/>
+                <w:sz w:val="16"/>
+              </w:rPr>
+              <w:t xml:space="preserve">43,933</w:t>
+            </w:r>
+          </w:p>
+        </w:tc>
+        <w:tc>
+          <w:tcPr>
+            <w:tcW w:w="1417" w:type="dxa"/>
+          </w:tcPr>
+          <w:p>
+            <w:pPr>
+              <w:spacing w:before="0" w:after="0" w:line="240" w:lineRule="auto"/>
+              <w:jc w:val="right"/>
+            </w:pPr>
+            <w:r>
+              <w:rPr>
+                <w:b w:val="0"/>
+                <w:i w:val="0"/>
+                <w:sz w:val="16"/>
+              </w:rPr>
+              <w:t xml:space="preserve">13,967</w:t>
             </w:r>
           </w:p>
         </w:tc>
@@ -29596,7 +29611,7 @@
                 <w:i w:val="0"/>
                 <w:sz w:val="16"/>
               </w:rPr>
-              <w:t xml:space="preserve">6,88,336</w:t>
+              <w:t xml:space="preserve">6,86,709</w:t>
             </w:r>
           </w:p>
         </w:tc>
@@ -29616,7 +29631,7 @@
                 <w:i w:val="0"/>
                 <w:sz w:val="16"/>
               </w:rPr>
-              <w:t xml:space="preserve">7,33,966</w:t>
+              <w:t xml:space="preserve">7,35,593</w:t>
             </w:r>
           </w:p>
         </w:tc>
@@ -30304,7 +30319,7 @@
                 <w:i w:val="0"/>
                 <w:sz w:val="16"/>
               </w:rPr>
-              <w:t xml:space="preserve">10.41</w:t>
+              <w:t xml:space="preserve">10.38</w:t>
             </w:r>
           </w:p>
         </w:tc>
@@ -30324,7 +30339,7 @@
                 <w:i w:val="0"/>
                 <w:sz w:val="16"/>
               </w:rPr>
-              <w:t xml:space="preserve">2.59</w:t>
+              <w:t xml:space="preserve">2.60</w:t>
             </w:r>
           </w:p>
         </w:tc>
@@ -30437,7 +30452,7 @@
           <w:i/>
           <w:sz w:val="17"/>
         </w:rPr>
-        <w:t xml:space="preserve">DSCR = cash available for debt service (A) ÷ net interest and principal (B). Year I is the grace year (interest only). Average DSCR for Years I–VI = 3.37 (Years II–VI: 3.01) – comfortably above the 1.25–1.50 range that banks usually require; credit merit is a selection criterion for CHC (Cl. XI(i)(iv)).</w:t>
+        <w:t xml:space="preserve">DSCR = (A) ÷ (B). Year I is interest only. Average 3.37 (Years II–VI: 3.01) – well above the 1.25–1.50 banks need.</w:t>
       </w:r>
     </w:p>
     <w:p>
@@ -30829,7 +30844,7 @@
                 <w:i w:val="0"/>
                 <w:sz w:val="16"/>
               </w:rPr>
-              <w:t xml:space="preserve">Hire income – combine harvester (FA-1)</w:t>
+              <w:t xml:space="preserve">Hire income – combine harvester</w:t>
             </w:r>
           </w:p>
         </w:tc>
@@ -31021,7 +31036,7 @@
                 <w:i w:val="0"/>
                 <w:sz w:val="16"/>
               </w:rPr>
-              <w:t xml:space="preserve">Hire income – small implements (FA-1)</w:t>
+              <w:t xml:space="preserve">Hire income – small implements</w:t>
             </w:r>
           </w:p>
         </w:tc>
@@ -31607,7 +31622,7 @@
                 <w:i w:val="0"/>
                 <w:sz w:val="16"/>
               </w:rPr>
-              <w:t xml:space="preserve">(C) Operating profit before interest and depreciation (A – B)</w:t>
+              <w:t xml:space="preserve">(C) Operating profit (A – B)</w:t>
             </w:r>
           </w:p>
         </w:tc>
@@ -31807,7 +31822,7 @@
                 <w:i w:val="0"/>
                 <w:sz w:val="16"/>
               </w:rPr>
-              <w:t xml:space="preserve">Interest on the loan with interest, net of 3% AIF subvention (FA-4)</w:t>
+              <w:t xml:space="preserve">Interest, net of AIF subvention (FA-4)</w:t>
             </w:r>
           </w:p>
         </w:tc>
@@ -31999,7 +32014,7 @@
                 <w:i w:val="0"/>
                 <w:sz w:val="16"/>
               </w:rPr>
-              <w:t xml:space="preserve">Depreciation – book, WDV (FA-3)</w:t>
+              <w:t xml:space="preserve">Depreciation (FA-3)</w:t>
             </w:r>
           </w:p>
         </w:tc>
@@ -32785,7 +32800,7 @@
                 <w:i w:val="0"/>
                 <w:sz w:val="16"/>
               </w:rPr>
-              <w:t xml:space="preserve">Drawings by the proprietor (60% of net profit after tax)</w:t>
+              <w:t xml:space="preserve">Drawings by the owner (60% of E)</w:t>
             </w:r>
           </w:p>
         </w:tc>
@@ -32977,7 +32992,7 @@
                 <w:i w:val="0"/>
                 <w:sz w:val="16"/>
               </w:rPr>
-              <w:t xml:space="preserve">Profit retained in the business (to capital account)</w:t>
+              <w:t xml:space="preserve">Profit kept in the business</w:t>
             </w:r>
           </w:p>
         </w:tc>
@@ -33142,7 +33157,7 @@
           <w:i/>
           <w:sz w:val="17"/>
         </w:rPr>
-        <w:t xml:space="preserve">All figures follow FA-1 to FA-4. Drawings are assumed at 60% of the net profit after tax for the proprietor's household needs; the rest stays in the business (FA-8). The applicant draws no salary (Section 8.2).</w:t>
+        <w:t xml:space="preserve">Figures come from FA-1 to FA-4. The owner takes 60% of the profit after tax for his household; the rest stays in the business.</w:t>
       </w:r>
     </w:p>
     <w:p>
@@ -33547,7 +33562,7 @@
                 <w:i w:val="0"/>
                 <w:sz w:val="16"/>
               </w:rPr>
-              <w:t xml:space="preserve">Sources: margin money (own capital)</w:t>
+              <w:t xml:space="preserve">Margin money (own capital)</w:t>
             </w:r>
           </w:p>
         </w:tc>
@@ -33739,7 +33754,7 @@
                 <w:i w:val="0"/>
                 <w:sz w:val="16"/>
               </w:rPr>
-              <w:t xml:space="preserve">Bank term loan – with interest</w:t>
+              <w:t xml:space="preserve">Loan with interest</w:t>
             </w:r>
           </w:p>
         </w:tc>
@@ -33931,7 +33946,7 @@
                 <w:i w:val="0"/>
                 <w:sz w:val="16"/>
               </w:rPr>
-              <w:t xml:space="preserve">Bank term loan – without interest (against subsidy)</w:t>
+              <w:t xml:space="preserve">Loan without interest (against subsidy)</w:t>
             </w:r>
           </w:p>
         </w:tc>
@@ -34315,7 +34330,7 @@
                 <w:i w:val="0"/>
                 <w:sz w:val="16"/>
               </w:rPr>
-              <w:t xml:space="preserve">Add: depreciation (non-cash)</w:t>
+              <w:t xml:space="preserve">Add: depreciation</w:t>
             </w:r>
           </w:p>
         </w:tc>
@@ -34507,7 +34522,7 @@
                 <w:i w:val="0"/>
                 <w:sz w:val="16"/>
               </w:rPr>
-              <w:t xml:space="preserve">Add: AMC and insurance paid from TFO (non-cash)</w:t>
+              <w:t xml:space="preserve">Add: AMC and insurance from TFO</w:t>
             </w:r>
           </w:p>
         </w:tc>
@@ -34545,26 +34560,26 @@
                 <w:i w:val="0"/>
                 <w:sz w:val="16"/>
               </w:rPr>
-              <w:t xml:space="preserve">45,560</w:t>
-            </w:r>
-          </w:p>
-        </w:tc>
-        <w:tc>
-          <w:tcPr>
-            <w:tcW w:w="1417" w:type="dxa"/>
-          </w:tcPr>
-          <w:p>
-            <w:pPr>
-              <w:spacing w:before="0" w:after="0" w:line="240" w:lineRule="auto"/>
-              <w:jc w:val="right"/>
-            </w:pPr>
-            <w:r>
-              <w:rPr>
-                <w:b w:val="0"/>
-                <w:i w:val="0"/>
-                <w:sz w:val="16"/>
-              </w:rPr>
-              <w:t xml:space="preserve">12,340</w:t>
+              <w:t xml:space="preserve">43,933</w:t>
+            </w:r>
+          </w:p>
+        </w:tc>
+        <w:tc>
+          <w:tcPr>
+            <w:tcW w:w="1417" w:type="dxa"/>
+          </w:tcPr>
+          <w:p>
+            <w:pPr>
+              <w:spacing w:before="0" w:after="0" w:line="240" w:lineRule="auto"/>
+              <w:jc w:val="right"/>
+            </w:pPr>
+            <w:r>
+              <w:rPr>
+                <w:b w:val="0"/>
+                <w:i w:val="0"/>
+                <w:sz w:val="16"/>
+              </w:rPr>
+              <w:t xml:space="preserve">13,967</w:t>
             </w:r>
           </w:p>
         </w:tc>
@@ -34740,7 +34755,7 @@
                 <w:i w:val="0"/>
                 <w:sz w:val="16"/>
               </w:rPr>
-              <w:t xml:space="preserve">6,22,189</w:t>
+              <w:t xml:space="preserve">6,20,562</w:t>
             </w:r>
           </w:p>
         </w:tc>
@@ -34760,7 +34775,7 @@
                 <w:i w:val="0"/>
                 <w:sz w:val="16"/>
               </w:rPr>
-              <w:t xml:space="preserve">6,71,126</w:t>
+              <w:t xml:space="preserve">6,72,753</w:t>
             </w:r>
           </w:p>
         </w:tc>
@@ -34900,7 +34915,7 @@
                 <w:i w:val="0"/>
                 <w:sz w:val="16"/>
               </w:rPr>
-              <w:t xml:space="preserve">Uses: machinery, shed, AMC and insurance (TFO)</w:t>
+              <w:t xml:space="preserve">Purchase of assets (TFO)</w:t>
             </w:r>
           </w:p>
         </w:tc>
@@ -35092,7 +35107,7 @@
                 <w:i w:val="0"/>
                 <w:sz w:val="16"/>
               </w:rPr>
-              <w:t xml:space="preserve">Repayment – loan with interest (FA-4)</w:t>
+              <w:t xml:space="preserve">Loan repayment (FA-4)</w:t>
             </w:r>
           </w:p>
         </w:tc>
@@ -35284,7 +35299,7 @@
                 <w:i w:val="0"/>
                 <w:sz w:val="16"/>
               </w:rPr>
-              <w:t xml:space="preserve">Drawings by the proprietor (FA-6)</w:t>
+              <w:t xml:space="preserve">Drawings by the owner (FA-6)</w:t>
             </w:r>
           </w:p>
         </w:tc>
@@ -35718,7 +35733,7 @@
                 <w:i w:val="0"/>
                 <w:sz w:val="16"/>
               </w:rPr>
-              <w:t xml:space="preserve">5,33,870</w:t>
+              <w:t xml:space="preserve">5,32,243</w:t>
             </w:r>
           </w:p>
         </w:tc>
@@ -35738,7 +35753,7 @@
                 <w:i w:val="0"/>
                 <w:sz w:val="16"/>
               </w:rPr>
-              <w:t xml:space="preserve">2,74,704</w:t>
+              <w:t xml:space="preserve">2,76,331</w:t>
             </w:r>
           </w:p>
         </w:tc>
@@ -35878,7 +35893,7 @@
                 <w:i w:val="0"/>
                 <w:sz w:val="16"/>
               </w:rPr>
-              <w:t xml:space="preserve">Opening cash and bank balance</w:t>
+              <w:t xml:space="preserve">Opening cash balance</w:t>
             </w:r>
           </w:p>
         </w:tc>
@@ -35935,7 +35950,7 @@
                 <w:i w:val="0"/>
                 <w:sz w:val="16"/>
               </w:rPr>
-              <w:t xml:space="preserve">5,33,870</w:t>
+              <w:t xml:space="preserve">5,32,243</w:t>
             </w:r>
           </w:p>
         </w:tc>
@@ -36071,7 +36086,7 @@
                 <w:i w:val="0"/>
                 <w:sz w:val="16"/>
               </w:rPr>
-              <w:t xml:space="preserve">(D) Closing cash and bank balance</w:t>
+              <w:t xml:space="preserve">(D) Closing cash balance</w:t>
             </w:r>
           </w:p>
         </w:tc>
@@ -36111,7 +36126,7 @@
                 <w:i w:val="0"/>
                 <w:sz w:val="16"/>
               </w:rPr>
-              <w:t xml:space="preserve">5,33,870</w:t>
+              <w:t xml:space="preserve">5,32,243</w:t>
             </w:r>
           </w:p>
         </w:tc>
@@ -36244,7 +36259,7 @@
           <w:i/>
           <w:sz w:val="17"/>
         </w:rPr>
-        <w:t xml:space="preserve">Year 0 is the set-up year (2026-27, before 31 March 2027). The Govt. subsidy of Rs 11,15,636 is credited by the bank to the Subsidy Reserve Fund, not to the applicant; in Year VI it is set off against the loan without interest – a book adjustment with no cash flow (Cl. XIII(3)). The cash balance stays positive in every year.</w:t>
+        <w:t xml:space="preserve">Year 0 = set-up (2026-27). The subsidy stays in the Subsidy Reserve Fund and is set off against the loan without interest in Year VI – no cash moves. Cash stays positive every year.</w:t>
       </w:r>
     </w:p>
     <w:p>
@@ -36266,7 +36281,7 @@
           <w:sz w:val="23"/>
           <w:szCs w:val="23"/>
         </w:rPr>
-        <w:t xml:space="preserve">FA-8 Projected balance sheet as at 31 March, and key ratios (Rs)</w:t>
+        <w:t xml:space="preserve">FA-8 Projected balance sheet (31 March) and ratios (Rs)</w:t>
       </w:r>
     </w:p>
     <w:tbl>
@@ -36650,7 +36665,7 @@
                 <w:i w:val="0"/>
                 <w:sz w:val="16"/>
               </w:rPr>
-              <w:t xml:space="preserve">Proprietor's capital (margin money + profit retained)</w:t>
+              <w:t xml:space="preserve">Owner's capital (margin + profit kept)</w:t>
             </w:r>
           </w:p>
         </w:tc>
@@ -36842,7 +36857,7 @@
                 <w:i w:val="0"/>
                 <w:sz w:val="16"/>
               </w:rPr>
-              <w:t xml:space="preserve">Capital subsidy – Govt. grant (back-ended)</w:t>
+              <w:t xml:space="preserve">Capital subsidy (Govt. grant)</w:t>
             </w:r>
           </w:p>
         </w:tc>
@@ -37034,7 +37049,7 @@
                 <w:i w:val="0"/>
                 <w:sz w:val="16"/>
               </w:rPr>
-              <w:t xml:space="preserve">Term loan – with interest (outstanding)</w:t>
+              <w:t xml:space="preserve">Loan with interest</w:t>
             </w:r>
           </w:p>
         </w:tc>
@@ -37226,7 +37241,7 @@
                 <w:i w:val="0"/>
                 <w:sz w:val="16"/>
               </w:rPr>
-              <w:t xml:space="preserve">Term loan – without interest (against subsidy)</w:t>
+              <w:t xml:space="preserve">Loan without interest</w:t>
             </w:r>
           </w:p>
         </w:tc>
@@ -37619,7 +37634,7 @@
                 <w:i w:val="0"/>
                 <w:sz w:val="16"/>
               </w:rPr>
-              <w:t xml:space="preserve">Net fixed assets – machinery and shed (WDV, FA-3)</w:t>
+              <w:t xml:space="preserve">Machinery and shed, net of depreciation (FA-3)</w:t>
             </w:r>
           </w:p>
         </w:tc>
@@ -37849,7 +37864,7 @@
                 <w:i w:val="0"/>
                 <w:sz w:val="16"/>
               </w:rPr>
-              <w:t xml:space="preserve">12,340</w:t>
+              <w:t xml:space="preserve">13,967</w:t>
             </w:r>
           </w:p>
         </w:tc>
@@ -38003,7 +38018,7 @@
                 <w:i w:val="0"/>
                 <w:sz w:val="16"/>
               </w:rPr>
-              <w:t xml:space="preserve">Subsidy Reserve Fund with the bank (locked in)</w:t>
+              <w:t xml:space="preserve">Subsidy Reserve Fund (with the bank)</w:t>
             </w:r>
           </w:p>
         </w:tc>
@@ -38195,7 +38210,7 @@
                 <w:i w:val="0"/>
                 <w:sz w:val="16"/>
               </w:rPr>
-              <w:t xml:space="preserve">Cash and bank balance (FA-7)</w:t>
+              <w:t xml:space="preserve">Cash balance (FA-7)</w:t>
             </w:r>
           </w:p>
         </w:tc>
@@ -38233,7 +38248,7 @@
                 <w:i w:val="0"/>
                 <w:sz w:val="16"/>
               </w:rPr>
-              <w:t xml:space="preserve">5,33,870</w:t>
+              <w:t xml:space="preserve">5,32,243</w:t>
             </w:r>
           </w:p>
         </w:tc>
@@ -38588,7 +38603,7 @@
                 <w:i w:val="0"/>
                 <w:sz w:val="16"/>
               </w:rPr>
-              <w:t xml:space="preserve">Current ratio (cash + prepaid ÷ instalments due next year)</w:t>
+              <w:t xml:space="preserve">Current ratio</w:t>
             </w:r>
           </w:p>
         </w:tc>
@@ -38780,7 +38795,7 @@
                 <w:i w:val="0"/>
                 <w:sz w:val="16"/>
               </w:rPr>
-              <w:t xml:space="preserve">Debt–equity ratio (loan with interest ÷ capital + subsidy)</w:t>
+              <w:t xml:space="preserve">Debt–equity ratio</w:t>
             </w:r>
           </w:p>
         </w:tc>
@@ -38972,7 +38987,7 @@
                 <w:i w:val="0"/>
                 <w:sz w:val="16"/>
               </w:rPr>
-              <w:t xml:space="preserve">Fixed asset coverage ratio (net fixed assets ÷ loan with interest)</w:t>
+              <w:t xml:space="preserve">Fixed asset coverage ratio</w:t>
             </w:r>
           </w:p>
         </w:tc>
@@ -39164,7 +39179,7 @@
                 <w:i w:val="0"/>
                 <w:sz w:val="16"/>
               </w:rPr>
-              <w:t xml:space="preserve">Debt service coverage ratio (FA-5)</w:t>
+              <w:t xml:space="preserve">DSCR (FA-5)</w:t>
             </w:r>
           </w:p>
         </w:tc>
@@ -39202,26 +39217,26 @@
                 <w:i w:val="0"/>
                 <w:sz w:val="16"/>
               </w:rPr>
-              <w:t xml:space="preserve">10.41</w:t>
-            </w:r>
-          </w:p>
-        </w:tc>
-        <w:tc>
-          <w:tcPr>
-            <w:tcW w:w="1417" w:type="dxa"/>
-          </w:tcPr>
-          <w:p>
-            <w:pPr>
-              <w:spacing w:before="0" w:after="0" w:line="240" w:lineRule="auto"/>
-              <w:jc w:val="right"/>
-            </w:pPr>
-            <w:r>
-              <w:rPr>
-                <w:b w:val="0"/>
-                <w:i w:val="0"/>
-                <w:sz w:val="16"/>
-              </w:rPr>
-              <w:t xml:space="preserve">2.59</w:t>
+              <w:t xml:space="preserve">10.38</w:t>
+            </w:r>
+          </w:p>
+        </w:tc>
+        <w:tc>
+          <w:tcPr>
+            <w:tcW w:w="1417" w:type="dxa"/>
+          </w:tcPr>
+          <w:p>
+            <w:pPr>
+              <w:spacing w:before="0" w:after="0" w:line="240" w:lineRule="auto"/>
+              <w:jc w:val="right"/>
+            </w:pPr>
+            <w:r>
+              <w:rPr>
+                <w:b w:val="0"/>
+                <w:i w:val="0"/>
+                <w:sz w:val="16"/>
+              </w:rPr>
+              <w:t xml:space="preserve">2.60</w:t>
             </w:r>
           </w:p>
         </w:tc>
@@ -39329,7 +39344,7 @@
           <w:i/>
           <w:sz w:val="17"/>
         </w:rPr>
-        <w:t xml:space="preserve">The loan without interest is matched by the Subsidy Reserve Fund until both are set off in Year VI, when the loan with interest is fully repaid (Cl. XIII(3)). Machinery and the shed are shown at full cost less book depreciation, with the subsidy as a capital grant. Total assets equal total liabilities in every year.</w:t>
+        <w:t xml:space="preserve">The loan without interest and the Subsidy Reserve Fund cancel out in Year VI. Current ratio = (cash + prepaid) ÷ next year's instalments; debt–equity = loan with interest ÷ (capital + subsidy); fixed asset coverage = net fixed assets ÷ loan with interest.</w:t>
       </w:r>
     </w:p>
     <w:p>
@@ -39872,64 +39887,64 @@
                 <w:i w:val="0"/>
                 <w:sz w:val="16"/>
               </w:rPr>
-              <w:t xml:space="preserve">Variable costs – fuel, operator and helper, shifting, small implements, repairs</w:t>
-            </w:r>
-          </w:p>
-        </w:tc>
-        <w:tc>
-          <w:tcPr>
-            <w:tcW w:w="1417" w:type="dxa"/>
-          </w:tcPr>
-          <w:p>
-            <w:pPr>
-              <w:spacing w:before="0" w:after="0" w:line="240" w:lineRule="auto"/>
-              <w:jc w:val="right"/>
-            </w:pPr>
-            <w:r>
-              <w:rPr>
-                <w:b w:val="0"/>
-                <w:i w:val="0"/>
-                <w:sz w:val="16"/>
-              </w:rPr>
-              <w:t xml:space="preserve">5,88,664</w:t>
-            </w:r>
-          </w:p>
-        </w:tc>
-        <w:tc>
-          <w:tcPr>
-            <w:tcW w:w="1417" w:type="dxa"/>
-          </w:tcPr>
-          <w:p>
-            <w:pPr>
-              <w:spacing w:before="0" w:after="0" w:line="240" w:lineRule="auto"/>
-              <w:jc w:val="right"/>
-            </w:pPr>
-            <w:r>
-              <w:rPr>
-                <w:b w:val="0"/>
-                <w:i w:val="0"/>
-                <w:sz w:val="16"/>
-              </w:rPr>
-              <w:t xml:space="preserve">7,76,139</w:t>
-            </w:r>
-          </w:p>
-        </w:tc>
-        <w:tc>
-          <w:tcPr>
-            <w:tcW w:w="1417" w:type="dxa"/>
-          </w:tcPr>
-          <w:p>
-            <w:pPr>
-              <w:spacing w:before="0" w:after="0" w:line="240" w:lineRule="auto"/>
-              <w:jc w:val="right"/>
-            </w:pPr>
-            <w:r>
-              <w:rPr>
-                <w:b w:val="0"/>
-                <w:i w:val="0"/>
-                <w:sz w:val="16"/>
-              </w:rPr>
-              <w:t xml:space="preserve">9,03,283</w:t>
+              <w:t xml:space="preserve">Variable costs (fuel, wages, shifting, repairs, small implements)</w:t>
+            </w:r>
+          </w:p>
+        </w:tc>
+        <w:tc>
+          <w:tcPr>
+            <w:tcW w:w="1417" w:type="dxa"/>
+          </w:tcPr>
+          <w:p>
+            <w:pPr>
+              <w:spacing w:before="0" w:after="0" w:line="240" w:lineRule="auto"/>
+              <w:jc w:val="right"/>
+            </w:pPr>
+            <w:r>
+              <w:rPr>
+                <w:b w:val="0"/>
+                <w:i w:val="0"/>
+                <w:sz w:val="16"/>
+              </w:rPr>
+              <w:t xml:space="preserve">5,90,291</w:t>
+            </w:r>
+          </w:p>
+        </w:tc>
+        <w:tc>
+          <w:tcPr>
+            <w:tcW w:w="1417" w:type="dxa"/>
+          </w:tcPr>
+          <w:p>
+            <w:pPr>
+              <w:spacing w:before="0" w:after="0" w:line="240" w:lineRule="auto"/>
+              <w:jc w:val="right"/>
+            </w:pPr>
+            <w:r>
+              <w:rPr>
+                <w:b w:val="0"/>
+                <w:i w:val="0"/>
+                <w:sz w:val="16"/>
+              </w:rPr>
+              <w:t xml:space="preserve">7,71,732</w:t>
+            </w:r>
+          </w:p>
+        </w:tc>
+        <w:tc>
+          <w:tcPr>
+            <w:tcW w:w="1417" w:type="dxa"/>
+          </w:tcPr>
+          <w:p>
+            <w:pPr>
+              <w:spacing w:before="0" w:after="0" w:line="240" w:lineRule="auto"/>
+              <w:jc w:val="right"/>
+            </w:pPr>
+            <w:r>
+              <w:rPr>
+                <w:b w:val="0"/>
+                <w:i w:val="0"/>
+                <w:sz w:val="16"/>
+              </w:rPr>
+              <w:t xml:space="preserve">8,98,063</w:t>
             </w:r>
           </w:p>
         </w:tc>
@@ -40046,7 +40061,7 @@
                 <w:i w:val="0"/>
                 <w:sz w:val="16"/>
               </w:rPr>
-              <w:t xml:space="preserve">(A) Contribution (hire income – variable costs)</w:t>
+              <w:t xml:space="preserve">(A) Contribution</w:t>
             </w:r>
           </w:p>
         </w:tc>
@@ -40066,7 +40081,7 @@
                 <w:i w:val="0"/>
                 <w:sz w:val="16"/>
               </w:rPr>
-              <w:t xml:space="preserve">7,46,336</w:t>
+              <w:t xml:space="preserve">7,44,709</w:t>
             </w:r>
           </w:p>
         </w:tc>
@@ -40086,7 +40101,7 @@
                 <w:i w:val="0"/>
                 <w:sz w:val="16"/>
               </w:rPr>
-              <w:t xml:space="preserve">8,28,086</w:t>
+              <w:t xml:space="preserve">8,32,493</w:t>
             </w:r>
           </w:p>
         </w:tc>
@@ -40106,7 +40121,7 @@
                 <w:i w:val="0"/>
                 <w:sz w:val="16"/>
               </w:rPr>
-              <w:t xml:space="preserve">8,66,986</w:t>
+              <w:t xml:space="preserve">8,72,206</w:t>
             </w:r>
           </w:p>
         </w:tc>
@@ -40226,64 +40241,64 @@
                 <w:i w:val="0"/>
                 <w:sz w:val="16"/>
               </w:rPr>
-              <w:t xml:space="preserve">Fixed costs – AMC, insurance and miscellaneous</w:t>
-            </w:r>
-          </w:p>
-        </w:tc>
-        <w:tc>
-          <w:tcPr>
-            <w:tcW w:w="1417" w:type="dxa"/>
-          </w:tcPr>
-          <w:p>
-            <w:pPr>
-              <w:spacing w:before="0" w:after="0" w:line="240" w:lineRule="auto"/>
-              <w:jc w:val="right"/>
-            </w:pPr>
-            <w:r>
-              <w:rPr>
-                <w:b w:val="0"/>
-                <w:i w:val="0"/>
-                <w:sz w:val="16"/>
-              </w:rPr>
-              <w:t xml:space="preserve">1,03,560</w:t>
-            </w:r>
-          </w:p>
-        </w:tc>
-        <w:tc>
-          <w:tcPr>
-            <w:tcW w:w="1417" w:type="dxa"/>
-          </w:tcPr>
-          <w:p>
-            <w:pPr>
-              <w:spacing w:before="0" w:after="0" w:line="240" w:lineRule="auto"/>
-              <w:jc w:val="right"/>
-            </w:pPr>
-            <w:r>
-              <w:rPr>
-                <w:b w:val="0"/>
-                <w:i w:val="0"/>
-                <w:sz w:val="16"/>
-              </w:rPr>
-              <w:t xml:space="preserve">1,06,460</w:t>
-            </w:r>
-          </w:p>
-        </w:tc>
-        <w:tc>
-          <w:tcPr>
-            <w:tcW w:w="1417" w:type="dxa"/>
-          </w:tcPr>
-          <w:p>
-            <w:pPr>
-              <w:spacing w:before="0" w:after="0" w:line="240" w:lineRule="auto"/>
-              <w:jc w:val="right"/>
-            </w:pPr>
-            <w:r>
-              <w:rPr>
-                <w:b w:val="0"/>
-                <w:i w:val="0"/>
-                <w:sz w:val="16"/>
-              </w:rPr>
-              <w:t xml:space="preserve">1,14,725</w:t>
+              <w:t xml:space="preserve">Fixed costs – AMC, insurance, misc.</w:t>
+            </w:r>
+          </w:p>
+        </w:tc>
+        <w:tc>
+          <w:tcPr>
+            <w:tcW w:w="1417" w:type="dxa"/>
+          </w:tcPr>
+          <w:p>
+            <w:pPr>
+              <w:spacing w:before="0" w:after="0" w:line="240" w:lineRule="auto"/>
+              <w:jc w:val="right"/>
+            </w:pPr>
+            <w:r>
+              <w:rPr>
+                <w:b w:val="0"/>
+                <w:i w:val="0"/>
+                <w:sz w:val="16"/>
+              </w:rPr>
+              <w:t xml:space="preserve">1,01,933</w:t>
+            </w:r>
+          </w:p>
+        </w:tc>
+        <w:tc>
+          <w:tcPr>
+            <w:tcW w:w="1417" w:type="dxa"/>
+          </w:tcPr>
+          <w:p>
+            <w:pPr>
+              <w:spacing w:before="0" w:after="0" w:line="240" w:lineRule="auto"/>
+              <w:jc w:val="right"/>
+            </w:pPr>
+            <w:r>
+              <w:rPr>
+                <w:b w:val="0"/>
+                <w:i w:val="0"/>
+                <w:sz w:val="16"/>
+              </w:rPr>
+              <w:t xml:space="preserve">1,10,867</w:t>
+            </w:r>
+          </w:p>
+        </w:tc>
+        <w:tc>
+          <w:tcPr>
+            <w:tcW w:w="1417" w:type="dxa"/>
+          </w:tcPr>
+          <w:p>
+            <w:pPr>
+              <w:spacing w:before="0" w:after="0" w:line="240" w:lineRule="auto"/>
+              <w:jc w:val="right"/>
+            </w:pPr>
+            <w:r>
+              <w:rPr>
+                <w:b w:val="0"/>
+                <w:i w:val="0"/>
+                <w:sz w:val="16"/>
+              </w:rPr>
+              <w:t xml:space="preserve">1,19,945</w:t>
             </w:r>
           </w:p>
         </w:tc>
@@ -40399,7 +40414,7 @@
                 <w:i w:val="0"/>
                 <w:sz w:val="16"/>
               </w:rPr>
-              <w:t xml:space="preserve">Fixed costs – net interest and depreciation</w:t>
+              <w:t xml:space="preserve">Fixed costs – interest, depreciation</w:t>
             </w:r>
           </w:p>
         </w:tc>
@@ -40593,7 +40608,7 @@
                 <w:i w:val="0"/>
                 <w:sz w:val="16"/>
               </w:rPr>
-              <w:t xml:space="preserve">5,99,138</w:t>
+              <w:t xml:space="preserve">5,97,511</w:t>
             </w:r>
           </w:p>
         </w:tc>
@@ -40613,7 +40628,7 @@
                 <w:i w:val="0"/>
                 <w:sz w:val="16"/>
               </w:rPr>
-              <w:t xml:space="preserve">5,34,866</w:t>
+              <w:t xml:space="preserve">5,39,273</w:t>
             </w:r>
           </w:p>
         </w:tc>
@@ -40633,7 +40648,7 @@
                 <w:i w:val="0"/>
                 <w:sz w:val="16"/>
               </w:rPr>
-              <w:t xml:space="preserve">4,75,562</w:t>
+              <w:t xml:space="preserve">4,80,782</w:t>
             </w:r>
           </w:p>
         </w:tc>
@@ -40926,64 +40941,64 @@
                 <w:i w:val="0"/>
                 <w:sz w:val="16"/>
               </w:rPr>
-              <w:t xml:space="preserve">Break-even point (% of the year's planned operation) = B ÷ A</w:t>
-            </w:r>
-          </w:p>
-        </w:tc>
-        <w:tc>
-          <w:tcPr>
-            <w:tcW w:w="1417" w:type="dxa"/>
-          </w:tcPr>
-          <w:p>
-            <w:pPr>
-              <w:spacing w:before="0" w:after="0" w:line="240" w:lineRule="auto"/>
-              <w:jc w:val="right"/>
-            </w:pPr>
-            <w:r>
-              <w:rPr>
-                <w:b w:val="0"/>
-                <w:i w:val="0"/>
-                <w:sz w:val="16"/>
-              </w:rPr>
-              <w:t xml:space="preserve">80.3%</w:t>
-            </w:r>
-          </w:p>
-        </w:tc>
-        <w:tc>
-          <w:tcPr>
-            <w:tcW w:w="1417" w:type="dxa"/>
-          </w:tcPr>
-          <w:p>
-            <w:pPr>
-              <w:spacing w:before="0" w:after="0" w:line="240" w:lineRule="auto"/>
-              <w:jc w:val="right"/>
-            </w:pPr>
-            <w:r>
-              <w:rPr>
-                <w:b w:val="0"/>
-                <w:i w:val="0"/>
-                <w:sz w:val="16"/>
-              </w:rPr>
-              <w:t xml:space="preserve">64.6%</w:t>
-            </w:r>
-          </w:p>
-        </w:tc>
-        <w:tc>
-          <w:tcPr>
-            <w:tcW w:w="1417" w:type="dxa"/>
-          </w:tcPr>
-          <w:p>
-            <w:pPr>
-              <w:spacing w:before="0" w:after="0" w:line="240" w:lineRule="auto"/>
-              <w:jc w:val="right"/>
-            </w:pPr>
-            <w:r>
-              <w:rPr>
-                <w:b w:val="0"/>
-                <w:i w:val="0"/>
-                <w:sz w:val="16"/>
-              </w:rPr>
-              <w:t xml:space="preserve">54.9%</w:t>
+              <w:t xml:space="preserve">Break-even (% of planned use) = B ÷ A</w:t>
+            </w:r>
+          </w:p>
+        </w:tc>
+        <w:tc>
+          <w:tcPr>
+            <w:tcW w:w="1417" w:type="dxa"/>
+          </w:tcPr>
+          <w:p>
+            <w:pPr>
+              <w:spacing w:before="0" w:after="0" w:line="240" w:lineRule="auto"/>
+              <w:jc w:val="right"/>
+            </w:pPr>
+            <w:r>
+              <w:rPr>
+                <w:b w:val="0"/>
+                <w:i w:val="0"/>
+                <w:sz w:val="16"/>
+              </w:rPr>
+              <w:t xml:space="preserve">80.2%</w:t>
+            </w:r>
+          </w:p>
+        </w:tc>
+        <w:tc>
+          <w:tcPr>
+            <w:tcW w:w="1417" w:type="dxa"/>
+          </w:tcPr>
+          <w:p>
+            <w:pPr>
+              <w:spacing w:before="0" w:after="0" w:line="240" w:lineRule="auto"/>
+              <w:jc w:val="right"/>
+            </w:pPr>
+            <w:r>
+              <w:rPr>
+                <w:b w:val="0"/>
+                <w:i w:val="0"/>
+                <w:sz w:val="16"/>
+              </w:rPr>
+              <w:t xml:space="preserve">64.8%</w:t>
+            </w:r>
+          </w:p>
+        </w:tc>
+        <w:tc>
+          <w:tcPr>
+            <w:tcW w:w="1417" w:type="dxa"/>
+          </w:tcPr>
+          <w:p>
+            <w:pPr>
+              <w:spacing w:before="0" w:after="0" w:line="240" w:lineRule="auto"/>
+              <w:jc w:val="right"/>
+            </w:pPr>
+            <w:r>
+              <w:rPr>
+                <w:b w:val="0"/>
+                <w:i w:val="0"/>
+                <w:sz w:val="16"/>
+              </w:rPr>
+              <w:t xml:space="preserve">55.1%</w:t>
             </w:r>
           </w:p>
         </w:tc>
@@ -41099,7 +41114,7 @@
                 <w:i w:val="0"/>
                 <w:sz w:val="16"/>
               </w:rPr>
-              <w:t xml:space="preserve">Capacity utilisation planned</w:t>
+              <w:t xml:space="preserve">Planned use of capacity</w:t>
             </w:r>
           </w:p>
         </w:tc>
@@ -41273,7 +41288,7 @@
                 <w:i w:val="0"/>
                 <w:sz w:val="16"/>
               </w:rPr>
-              <w:t xml:space="preserve">Break-even point (% of full capacity)</w:t>
+              <w:t xml:space="preserve">Break-even (% of full capacity)</w:t>
             </w:r>
           </w:p>
         </w:tc>
@@ -41293,7 +41308,7 @@
                 <w:i w:val="0"/>
                 <w:sz w:val="16"/>
               </w:rPr>
-              <w:t xml:space="preserve">48.2%</w:t>
+              <w:t xml:space="preserve">48.1%</w:t>
             </w:r>
           </w:p>
         </w:tc>
@@ -41313,7 +41328,7 @@
                 <w:i w:val="0"/>
                 <w:sz w:val="16"/>
               </w:rPr>
-              <w:t xml:space="preserve">45.2%</w:t>
+              <w:t xml:space="preserve">45.3%</w:t>
             </w:r>
           </w:p>
         </w:tc>
@@ -41333,7 +41348,7 @@
                 <w:i w:val="0"/>
                 <w:sz w:val="16"/>
               </w:rPr>
-              <w:t xml:space="preserve">41.1%</w:t>
+              <w:t xml:space="preserve">41.3%</w:t>
             </w:r>
           </w:p>
         </w:tc>
@@ -41453,64 +41468,64 @@
                 <w:i w:val="0"/>
                 <w:sz w:val="16"/>
               </w:rPr>
-              <w:t xml:space="preserve">Cash break-even (% of full capacity, excluding depreciation)</w:t>
-            </w:r>
-          </w:p>
-        </w:tc>
-        <w:tc>
-          <w:tcPr>
-            <w:tcW w:w="1417" w:type="dxa"/>
-          </w:tcPr>
-          <w:p>
-            <w:pPr>
-              <w:spacing w:before="0" w:after="0" w:line="240" w:lineRule="auto"/>
-              <w:jc w:val="right"/>
-            </w:pPr>
-            <w:r>
-              <w:rPr>
-                <w:b w:val="0"/>
-                <w:i w:val="0"/>
-                <w:sz w:val="16"/>
-              </w:rPr>
-              <w:t xml:space="preserve">13.6%</w:t>
-            </w:r>
-          </w:p>
-        </w:tc>
-        <w:tc>
-          <w:tcPr>
-            <w:tcW w:w="1417" w:type="dxa"/>
-          </w:tcPr>
-          <w:p>
-            <w:pPr>
-              <w:spacing w:before="0" w:after="0" w:line="240" w:lineRule="auto"/>
-              <w:jc w:val="right"/>
-            </w:pPr>
-            <w:r>
-              <w:rPr>
-                <w:b w:val="0"/>
-                <w:i w:val="0"/>
-                <w:sz w:val="16"/>
-              </w:rPr>
-              <w:t xml:space="preserve">14.3%</w:t>
-            </w:r>
-          </w:p>
-        </w:tc>
-        <w:tc>
-          <w:tcPr>
-            <w:tcW w:w="1417" w:type="dxa"/>
-          </w:tcPr>
-          <w:p>
-            <w:pPr>
-              <w:spacing w:before="0" w:after="0" w:line="240" w:lineRule="auto"/>
-              <w:jc w:val="right"/>
-            </w:pPr>
-            <w:r>
-              <w:rPr>
-                <w:b w:val="0"/>
-                <w:i w:val="0"/>
-                <w:sz w:val="16"/>
-              </w:rPr>
-              <w:t xml:space="preserve">14.2%</w:t>
+              <w:t xml:space="preserve">Cash break-even (% of full capacity)</w:t>
+            </w:r>
+          </w:p>
+        </w:tc>
+        <w:tc>
+          <w:tcPr>
+            <w:tcW w:w="1417" w:type="dxa"/>
+          </w:tcPr>
+          <w:p>
+            <w:pPr>
+              <w:spacing w:before="0" w:after="0" w:line="240" w:lineRule="auto"/>
+              <w:jc w:val="right"/>
+            </w:pPr>
+            <w:r>
+              <w:rPr>
+                <w:b w:val="0"/>
+                <w:i w:val="0"/>
+                <w:sz w:val="16"/>
+              </w:rPr>
+              <w:t xml:space="preserve">13.5%</w:t>
+            </w:r>
+          </w:p>
+        </w:tc>
+        <w:tc>
+          <w:tcPr>
+            <w:tcW w:w="1417" w:type="dxa"/>
+          </w:tcPr>
+          <w:p>
+            <w:pPr>
+              <w:spacing w:before="0" w:after="0" w:line="240" w:lineRule="auto"/>
+              <w:jc w:val="right"/>
+            </w:pPr>
+            <w:r>
+              <w:rPr>
+                <w:b w:val="0"/>
+                <w:i w:val="0"/>
+                <w:sz w:val="16"/>
+              </w:rPr>
+              <w:t xml:space="preserve">14.6%</w:t>
+            </w:r>
+          </w:p>
+        </w:tc>
+        <w:tc>
+          <w:tcPr>
+            <w:tcW w:w="1417" w:type="dxa"/>
+          </w:tcPr>
+          <w:p>
+            <w:pPr>
+              <w:spacing w:before="0" w:after="0" w:line="240" w:lineRule="auto"/>
+              <w:jc w:val="right"/>
+            </w:pPr>
+            <w:r>
+              <w:rPr>
+                <w:b w:val="0"/>
+                <w:i w:val="0"/>
+                <w:sz w:val="16"/>
+              </w:rPr>
+              <w:t xml:space="preserve">14.6%</w:t>
             </w:r>
           </w:p>
         </w:tc>
@@ -41599,7 +41614,7 @@
           <w:i/>
           <w:sz w:val="17"/>
         </w:rPr>
-        <w:t xml:space="preserve">Variable costs move with the hours worked; AMC, insurance, miscellaneous expenses, interest and depreciation are fixed. The CHC breaks even at 48.2% of full capacity in Year I against the planned 60%, and at 26.1% by Year VII against 80% – a wide margin of safety. In cash terms (excluding depreciation) it breaks even at only 13.6% of capacity in Year I.</w:t>
+        <w:t xml:space="preserve">Variable costs change with the hours worked; the rest are fixed. Break-even is 48.1% of capacity in Year I (60% planned) and 26.1% in Year VII (80% planned) – a wide safety margin. Cash break-even (without depreciation) is only 13.5% in Year I.</w:t>
       </w:r>
     </w:p>
     <w:p/>

</xml_diff>

<commit_message>
Correct applicant age to 63 and add Krishak Bandhu ID in v2 DPR
</commit_message>
<xml_diff>
--- a/DPR-CHC-Ramprasad-Biswas-Dakshin-Durgapur-2026-27-v2.docx
+++ b/DPR-CHC-Ramprasad-Biswas-Dakshin-Durgapur-2026-27-v2.docx
@@ -380,7 +380,7 @@
           <w:i w:val="0"/>
           <w:sz w:val="21"/>
         </w:rPr>
-        <w:t xml:space="preserve">S/o Sudhir Biswas   |   Age: 60 years   |   Male</w:t>
+        <w:t xml:space="preserve">S/o Sudhir Biswas   |   Age: 63 years   |   Male</w:t>
       </w:r>
     </w:p>
     <w:p>
@@ -809,7 +809,7 @@
                 <w:i w:val="0"/>
                 <w:sz w:val="18"/>
               </w:rPr>
-              <w:t xml:space="preserve">60 years / Male</w:t>
+              <w:t xml:space="preserve">63 years / Male</w:t>
             </w:r>
           </w:p>
         </w:tc>
@@ -1297,7 +1297,7 @@
                 <w:sz w:val="18"/>
                 <w:highlight w:val="none"/>
               </w:rPr>
-              <w:t xml:space="preserve">To be furnished (Krishak Bandhu is required; PM-KISAN if any)</w:t>
+              <w:t xml:space="preserve">Krishak Bandhu (Natun): XXXXXXXX2348 (masked); PM-KISAN: if any</w:t>
             </w:r>
           </w:p>
         </w:tc>
@@ -1524,7 +1524,7 @@
                 <w:i w:val="0"/>
                 <w:sz w:val="18"/>
               </w:rPr>
-              <w:t xml:space="preserve">Yes – farmer; registration No. to be furnished</w:t>
+              <w:t xml:space="preserve">Yes – Krishak Bandhu (Natun) ID XXXXXXXX2348 (masked)</w:t>
             </w:r>
           </w:p>
         </w:tc>
@@ -1698,7 +1698,7 @@
                 <w:i w:val="0"/>
                 <w:sz w:val="18"/>
               </w:rPr>
-              <w:t xml:space="preserve">Yes – 60 years</w:t>
+              <w:t xml:space="preserve">Yes – 63 years</w:t>
             </w:r>
           </w:p>
         </w:tc>
@@ -2101,7 +2101,7 @@
                 <w:i w:val="0"/>
                 <w:sz w:val="18"/>
               </w:rPr>
-              <w:t xml:space="preserve">Sri Ramprasad Biswas, S/o Sudhir Biswas – farmer, 60 years, Scheduled Caste</w:t>
+              <w:t xml:space="preserve">Sri Ramprasad Biswas, S/o Sudhir Biswas – farmer, 63 years, Scheduled Caste</w:t>
             </w:r>
           </w:p>
         </w:tc>

</xml_diff>